<commit_message>
feat: add highlight to generated templates and show merge keys (dev)
</commit_message>
<xml_diff>
--- a/apps/api/src/modules/applications/templates/arf-contract-facility-lo.docx
+++ b/apps/api/src/modules/applications/templates/arf-contract-facility-lo.docx
@@ -15,7 +15,58 @@
           <w:sz w:val="20"/>
           <w:szCs w:val="20"/>
         </w:rPr>
-        <w:t>Issuer ID: {issuer_id}</w:t>
+        <w:t>Issuer ID</w:t>
+      </w:r>
+      <w:r>
+        <w:rPr>
+          <w:sz w:val="20"/>
+          <w:szCs w:val="20"/>
+        </w:rPr>
+        <w:tab/>
+      </w:r>
+      <w:r>
+        <w:rPr>
+          <w:sz w:val="20"/>
+          <w:szCs w:val="20"/>
+        </w:rPr>
+        <w:tab/>
+      </w:r>
+      <w:r>
+        <w:rPr>
+          <w:sz w:val="20"/>
+          <w:szCs w:val="20"/>
+        </w:rPr>
+        <w:t>:</w:t>
+      </w:r>
+      <w:r>
+        <w:rPr>
+          <w:sz w:val="20"/>
+          <w:szCs w:val="20"/>
+        </w:rPr>
+        <w:t xml:space="preserve"> </w:t>
+      </w:r>
+      <w:r>
+        <w:rPr>
+          <w:sz w:val="20"/>
+          <w:szCs w:val="20"/>
+        </w:rPr>
+        <w:t>{</w:t>
+      </w:r>
+      <w:proofErr w:type="spellStart"/>
+      <w:r>
+        <w:rPr>
+          <w:sz w:val="20"/>
+          <w:szCs w:val="20"/>
+        </w:rPr>
+        <w:t>issuer_id</w:t>
+      </w:r>
+      <w:proofErr w:type="spellEnd"/>
+      <w:r>
+        <w:rPr>
+          <w:sz w:val="20"/>
+          <w:szCs w:val="20"/>
+        </w:rPr>
+        <w:t>}</w:t>
       </w:r>
     </w:p>
     <w:p>
@@ -31,7 +82,58 @@
           <w:sz w:val="20"/>
           <w:szCs w:val="20"/>
         </w:rPr>
-        <w:t>Our Reference: {our_reference}</w:t>
+        <w:t>Our Reference</w:t>
+      </w:r>
+      <w:r>
+        <w:rPr>
+          <w:sz w:val="20"/>
+          <w:szCs w:val="20"/>
+        </w:rPr>
+        <w:tab/>
+      </w:r>
+      <w:r>
+        <w:rPr>
+          <w:sz w:val="20"/>
+          <w:szCs w:val="20"/>
+        </w:rPr>
+        <w:tab/>
+      </w:r>
+      <w:r>
+        <w:rPr>
+          <w:sz w:val="20"/>
+          <w:szCs w:val="20"/>
+        </w:rPr>
+        <w:t>:</w:t>
+      </w:r>
+      <w:r>
+        <w:rPr>
+          <w:sz w:val="20"/>
+          <w:szCs w:val="20"/>
+        </w:rPr>
+        <w:t xml:space="preserve"> </w:t>
+      </w:r>
+      <w:r>
+        <w:rPr>
+          <w:sz w:val="20"/>
+          <w:szCs w:val="20"/>
+        </w:rPr>
+        <w:t>{</w:t>
+      </w:r>
+      <w:proofErr w:type="spellStart"/>
+      <w:r>
+        <w:rPr>
+          <w:sz w:val="20"/>
+          <w:szCs w:val="20"/>
+        </w:rPr>
+        <w:t>our_reference</w:t>
+      </w:r>
+      <w:proofErr w:type="spellEnd"/>
+      <w:r>
+        <w:rPr>
+          <w:sz w:val="20"/>
+          <w:szCs w:val="20"/>
+        </w:rPr>
+        <w:t>}</w:t>
       </w:r>
     </w:p>
     <w:p>
@@ -47,7 +149,65 @@
           <w:sz w:val="20"/>
           <w:szCs w:val="20"/>
         </w:rPr>
-        <w:t xml:space="preserve">Date: {letter_date}   </w:t>
+        <w:t>Date</w:t>
+      </w:r>
+      <w:r>
+        <w:rPr>
+          <w:sz w:val="20"/>
+          <w:szCs w:val="20"/>
+        </w:rPr>
+        <w:tab/>
+      </w:r>
+      <w:r>
+        <w:rPr>
+          <w:sz w:val="20"/>
+          <w:szCs w:val="20"/>
+        </w:rPr>
+        <w:tab/>
+      </w:r>
+      <w:r>
+        <w:rPr>
+          <w:sz w:val="20"/>
+          <w:szCs w:val="20"/>
+        </w:rPr>
+        <w:tab/>
+      </w:r>
+      <w:r>
+        <w:rPr>
+          <w:sz w:val="20"/>
+          <w:szCs w:val="20"/>
+        </w:rPr>
+        <w:t>:</w:t>
+      </w:r>
+      <w:r>
+        <w:rPr>
+          <w:sz w:val="20"/>
+          <w:szCs w:val="20"/>
+        </w:rPr>
+        <w:t xml:space="preserve"> </w:t>
+      </w:r>
+      <w:r>
+        <w:rPr>
+          <w:sz w:val="20"/>
+          <w:szCs w:val="20"/>
+        </w:rPr>
+        <w:t>{</w:t>
+      </w:r>
+      <w:proofErr w:type="spellStart"/>
+      <w:r>
+        <w:rPr>
+          <w:sz w:val="20"/>
+          <w:szCs w:val="20"/>
+        </w:rPr>
+        <w:t>letter_date</w:t>
+      </w:r>
+      <w:proofErr w:type="spellEnd"/>
+      <w:r>
+        <w:rPr>
+          <w:sz w:val="20"/>
+          <w:szCs w:val="20"/>
+        </w:rPr>
+        <w:t xml:space="preserve">}   </w:t>
       </w:r>
     </w:p>
     <w:p>
@@ -168,15 +328,13 @@
           <w:highlight w:val="yellow"/>
         </w:rPr>
       </w:pPr>
-      <w:proofErr w:type="gramStart"/>
-      <w:r>
-        <w:rPr>
-          <w:sz w:val="20"/>
-          <w:szCs w:val="20"/>
-        </w:rPr>
-        <w:t>Attention :</w:t>
-      </w:r>
-      <w:proofErr w:type="gramEnd"/>
+      <w:r>
+        <w:rPr>
+          <w:sz w:val="20"/>
+          <w:szCs w:val="20"/>
+        </w:rPr>
+        <w:t>Attention:</w:t>
+      </w:r>
       <w:r>
         <w:rPr>
           <w:sz w:val="20"/>

</xml_diff>

<commit_message>
fix: align LO signature fields and merge in NRIC as well
</commit_message>
<xml_diff>
--- a/apps/api/src/modules/applications/templates/arf-contract-facility-lo.docx
+++ b/apps/api/src/modules/applications/templates/arf-contract-facility-lo.docx
@@ -30,6 +30,12 @@
           <w:szCs w:val="20"/>
         </w:rPr>
         <w:tab/>
+      </w:r>
+      <w:r>
+        <w:rPr>
+          <w:sz w:val="20"/>
+          <w:szCs w:val="20"/>
+        </w:rPr>
         <w:t xml:space="preserve">: </w:t>
       </w:r>
       <w:r>
@@ -69,6 +75,12 @@
           <w:szCs w:val="20"/>
         </w:rPr>
         <w:tab/>
+      </w:r>
+      <w:r>
+        <w:rPr>
+          <w:sz w:val="20"/>
+          <w:szCs w:val="20"/>
+        </w:rPr>
         <w:t xml:space="preserve">: </w:t>
       </w:r>
       <w:r>
@@ -115,6 +127,12 @@
           <w:szCs w:val="20"/>
         </w:rPr>
         <w:tab/>
+      </w:r>
+      <w:r>
+        <w:rPr>
+          <w:sz w:val="20"/>
+          <w:szCs w:val="20"/>
+        </w:rPr>
         <w:t xml:space="preserve">: </w:t>
       </w:r>
       <w:r>
@@ -279,7 +297,6 @@
     <w:p>
       <w:pPr>
         <w:spacing w:after="0" w:line="360" w:lineRule="auto"/>
-        <w:ind w:left="720" w:firstLine="720"/>
         <w:rPr>
           <w:sz w:val="20"/>
           <w:szCs w:val="20"/>
@@ -482,9 +499,9 @@
         <w:tblLook w:val="04A0" w:firstRow="1" w:lastRow="0" w:firstColumn="1" w:lastColumn="0" w:noHBand="0" w:noVBand="1"/>
       </w:tblPr>
       <w:tblGrid>
-        <w:gridCol w:w="2917"/>
-        <w:gridCol w:w="397"/>
-        <w:gridCol w:w="5712"/>
+        <w:gridCol w:w="2929"/>
+        <w:gridCol w:w="398"/>
+        <w:gridCol w:w="5699"/>
       </w:tblGrid>
       <w:tr>
         <w:trPr>
@@ -964,7 +981,6 @@
                 <w:sz w:val="20"/>
                 <w:szCs w:val="20"/>
               </w:rPr>
-              <w:lastRenderedPageBreak/>
               <w:t xml:space="preserve">For the avoidance of doubt: </w:t>
             </w:r>
           </w:p>
@@ -988,6 +1004,7 @@
                 <w:sz w:val="20"/>
                 <w:szCs w:val="20"/>
               </w:rPr>
+              <w:lastRenderedPageBreak/>
               <w:t>the approval of the Financing Limit does not create any obligation on the Issuer to utilise the Facility in full or in part;</w:t>
             </w:r>
           </w:p>
@@ -1373,8 +1390,15 @@
                 <w:sz w:val="20"/>
                 <w:szCs w:val="20"/>
               </w:rPr>
+              <w:t xml:space="preserve">Determination of profit rate: The annual profit rate applicable to each Utilization shall be determined separately by the Operator before that Utilization is offered or listed as an Investment Note </w:t>
+            </w:r>
+            <w:r>
+              <w:rPr>
+                <w:sz w:val="20"/>
+                <w:szCs w:val="20"/>
+              </w:rPr>
               <w:lastRenderedPageBreak/>
-              <w:t>Determination of profit rate: The annual profit rate applicable to each Utilization shall be determined separately by the Operator before that Utilization is offered or listed as an Investment Note on the Platform. In determining the proposed rate, the Operator may consider the Issuer’s current risk assessment, payment history, the relevant Customer or Approved Paymaster, the characteristics and age of the Receivable, the requested tenure, prevailing market conditions, investor demand and return expectations, available funding, and the Operator’s applicable credit and pricing policies. The annual profit rate for a Utilization shall not exceed eighteen per cent (18%) per annum, or such lower maximum as may be prescribed under applicable laws, regulatory requirements or the Platform Rules.</w:t>
+              <w:t>on the Platform. In determining the proposed rate, the Operator may consider the Issuer’s current risk assessment, payment history, the relevant Customer or Approved Paymaster, the characteristics and age of the Receivable, the requested tenure, prevailing market conditions, investor demand and return expectations, available funding, and the Operator’s applicable credit and pricing policies. The annual profit rate for a Utilization shall not exceed eighteen per cent (18%) per annum, or such lower maximum as may be prescribed under applicable laws, regulatory requirements or the Platform Rules.</w:t>
             </w:r>
           </w:p>
           <w:p>
@@ -1634,7 +1658,6 @@
                 <w:sz w:val="20"/>
                 <w:szCs w:val="20"/>
               </w:rPr>
-              <w:lastRenderedPageBreak/>
               <w:t>AVAILABILITY PERIOD</w:t>
             </w:r>
           </w:p>
@@ -1693,7 +1716,29 @@
                 <w:sz w:val="20"/>
                 <w:szCs w:val="20"/>
               </w:rPr>
-              <w:t xml:space="preserve">The first utilisation of the Facility shall be made within thirty (30) days from the date of acceptance of this Letter of Offer, failing which SSP reserves the right to cancel or withdraw the Facility without further notice. </w:t>
+              <w:t xml:space="preserve">The first utilisation of the Facility shall be made </w:t>
+            </w:r>
+            <w:r>
+              <w:rPr>
+                <w:sz w:val="20"/>
+                <w:szCs w:val="20"/>
+              </w:rPr>
+              <w:t>within thirty (30) days</w:t>
+            </w:r>
+            <w:r>
+              <w:rPr>
+                <w:sz w:val="20"/>
+                <w:szCs w:val="20"/>
+              </w:rPr>
+              <w:t xml:space="preserve"> from the date of acceptance of this Letter of Offer, failing which SSP reserves </w:t>
+            </w:r>
+            <w:r>
+              <w:rPr>
+                <w:sz w:val="20"/>
+                <w:szCs w:val="20"/>
+              </w:rPr>
+              <w:lastRenderedPageBreak/>
+              <w:t xml:space="preserve">the right to cancel or withdraw the Facility without further notice. </w:t>
             </w:r>
           </w:p>
           <w:p>
@@ -2037,6 +2082,7 @@
                 <w:numId w:val="4"/>
               </w:numPr>
               <w:spacing w:line="360" w:lineRule="auto"/>
+              <w:ind w:left="1900" w:hanging="360"/>
               <w:jc w:val="both"/>
               <w:rPr>
                 <w:sz w:val="20"/>
@@ -2195,7 +2241,6 @@
                 <w:sz w:val="20"/>
                 <w:szCs w:val="20"/>
               </w:rPr>
-              <w:lastRenderedPageBreak/>
               <w:t>All the above and any other security documents shall be in such form and substance as may be stipulated by or acceptable to SSP at its absolute discretion and shall, unless otherwise determined by SSP, secure not only the present Facility(ies) but also all other existing and/or future financing facilities and/or accommodations granted or to be granted by SSP to the Issuer.</w:t>
             </w:r>
           </w:p>
@@ -2508,16 +2553,7 @@
                 <w:szCs w:val="20"/>
                 <w:lang w:val="en-US"/>
               </w:rPr>
-              <w:t xml:space="preserve">Subject to Shariah requirement, SSP shall be entitled at any time or from time to time to reasonably vary the fees with prior </w:t>
-            </w:r>
-            <w:r>
-              <w:rPr>
-                <w:sz w:val="20"/>
-                <w:szCs w:val="20"/>
-                <w:lang w:val="en-US"/>
-              </w:rPr>
-              <w:lastRenderedPageBreak/>
-              <w:t xml:space="preserve">notification given to the Issuer and the Issuer agrees that SSP is entitled at any time and from time to time to vary the same. </w:t>
+              <w:t xml:space="preserve">Subject to Shariah requirement, SSP shall be entitled at any time or from time to time to reasonably vary the fees with prior notification given to the Issuer and the Issuer agrees that SSP is entitled at any time and from time to time to vary the same. </w:t>
             </w:r>
           </w:p>
           <w:p>
@@ -2557,7 +2593,6 @@
                 <w:sz w:val="20"/>
                 <w:szCs w:val="20"/>
               </w:rPr>
-              <w:lastRenderedPageBreak/>
               <w:t>CONDITION PRECEDENT</w:t>
             </w:r>
           </w:p>
@@ -2693,6 +2728,7 @@
                 <w:sz w:val="20"/>
                 <w:szCs w:val="20"/>
               </w:rPr>
+              <w:lastRenderedPageBreak/>
               <w:t>SSP shall have received the following from the Issuer and/or the Security Party(ies), in form and substance satisfactory to SSP:</w:t>
             </w:r>
           </w:p>
@@ -2892,7 +2928,6 @@
                 <w:sz w:val="20"/>
                 <w:szCs w:val="20"/>
               </w:rPr>
-              <w:lastRenderedPageBreak/>
               <w:t>Compliance with Terms</w:t>
             </w:r>
           </w:p>
@@ -2986,6 +3021,7 @@
                 <w:sz w:val="20"/>
                 <w:szCs w:val="20"/>
               </w:rPr>
+              <w:lastRenderedPageBreak/>
               <w:t>Such other documents, information, or evidence as may be required by SSP from time to time at its absolute discretion have been duly provided.</w:t>
             </w:r>
           </w:p>
@@ -3155,7 +3191,14 @@
                 <w:sz w:val="20"/>
                 <w:szCs w:val="20"/>
               </w:rPr>
-              <w:t xml:space="preserve">Bullet </w:t>
+              <w:t>Bullet</w:t>
+            </w:r>
+            <w:r>
+              <w:rPr>
+                <w:sz w:val="20"/>
+                <w:szCs w:val="20"/>
+              </w:rPr>
+              <w:t xml:space="preserve"> </w:t>
             </w:r>
           </w:p>
           <w:p>
@@ -3603,15 +3646,7 @@
                 <w:sz w:val="20"/>
                 <w:szCs w:val="20"/>
               </w:rPr>
-              <w:t xml:space="preserve">Where a request has been approved, SSP will list an Investment Offer on the Platform, being an offer to the </w:t>
-            </w:r>
-            <w:r>
-              <w:rPr>
-                <w:sz w:val="20"/>
-                <w:szCs w:val="20"/>
-              </w:rPr>
-              <w:lastRenderedPageBreak/>
-              <w:t xml:space="preserve">Investors on the Platform to subscribe to the Issuer’s Investment Note. </w:t>
+              <w:t xml:space="preserve">Where a request has been approved, SSP will list an Investment Offer on the Platform, being an offer to the Investors on the Platform to subscribe to the Issuer’s Investment Note. </w:t>
             </w:r>
           </w:p>
           <w:p>
@@ -3657,7 +3692,15 @@
                 <w:sz w:val="20"/>
                 <w:szCs w:val="20"/>
               </w:rPr>
-              <w:t xml:space="preserve">Successful financing will be recorded and evidenced via Investment Note(s) prepared by SSP on Issuer’s behalf, and which will set out the final details and terms and legally binding on the Issuer. </w:t>
+              <w:t xml:space="preserve">Successful financing will be recorded and evidenced via Investment Note(s) prepared by SSP on Issuer’s behalf, </w:t>
+            </w:r>
+            <w:r>
+              <w:rPr>
+                <w:sz w:val="20"/>
+                <w:szCs w:val="20"/>
+              </w:rPr>
+              <w:lastRenderedPageBreak/>
+              <w:t xml:space="preserve">and which will set out the final details and terms and legally binding on the Issuer. </w:t>
             </w:r>
           </w:p>
           <w:p>
@@ -3772,7 +3815,15 @@
                 <w:sz w:val="20"/>
                 <w:szCs w:val="20"/>
               </w:rPr>
-              <w:t xml:space="preserve">The Issuer acknowledges and agrees that SSP does not owe any fiduciary or similar duty to the Issuer in connection with any of the Security Documents or any act or transaction carried out in connection thereto. </w:t>
+              <w:t xml:space="preserve">The Issuer acknowledges and agrees that SSP does not owe any fiduciary or similar duty to the Issuer in </w:t>
+            </w:r>
+            <w:r>
+              <w:rPr>
+                <w:sz w:val="20"/>
+                <w:szCs w:val="20"/>
+              </w:rPr>
+              <w:lastRenderedPageBreak/>
+              <w:t xml:space="preserve">connection with any of the Security Documents or any act or transaction carried out in connection thereto. </w:t>
             </w:r>
           </w:p>
           <w:p>
@@ -4193,6 +4244,7 @@
                 <w:sz w:val="20"/>
                 <w:szCs w:val="20"/>
               </w:rPr>
+              <w:lastRenderedPageBreak/>
               <w:t>The Issuer agrees and hereby permits that, for as long as the Facility continues and/or any indebtedness remains outstanding, SSP shall be entitled to disclose all or any part of any information relating to the Issuer’s business (including its current or future accounts, reports, or documents supplied in connection with this Facility) to any of the following parties:</w:t>
             </w:r>
           </w:p>
@@ -4420,6 +4472,7 @@
                 <w:sz w:val="20"/>
                 <w:szCs w:val="20"/>
               </w:rPr>
+              <w:lastRenderedPageBreak/>
               <w:t>pursuant to any court order, arbitration award, or other legal process, or in connection with any legal action, suit, or proceeding relating to this Letter of Offer or any other transaction documents;</w:t>
             </w:r>
           </w:p>
@@ -4942,6 +4995,7 @@
           <w:sz w:val="20"/>
           <w:szCs w:val="20"/>
         </w:rPr>
+        <w:lastRenderedPageBreak/>
         <w:t>This offer is made subject to SSP’s absolute discretion to withdraw, vary, suspend or terminate the offer, whether prior to, on or after the acceptance of this Letter of Offer, if SSP deems it necessary to do so in order to safeguard its interests (including in view of any circumstances, financial or otherwise, relating to the Issuer of which SSP has knowledge).</w:t>
       </w:r>
     </w:p>
@@ -4977,7 +5031,21 @@
           <w:sz w:val="20"/>
           <w:szCs w:val="20"/>
         </w:rPr>
-        <w:t>In such an event, SSP shall provide the Issuer with not less than twenty-one (21) days’ prior written notice, which may include notification via electronic means.</w:t>
+        <w:t xml:space="preserve">In such an event, SSP shall provide the Issuer with not less than </w:t>
+      </w:r>
+      <w:r>
+        <w:rPr>
+          <w:sz w:val="20"/>
+          <w:szCs w:val="20"/>
+        </w:rPr>
+        <w:t>twenty-one (21) days’</w:t>
+      </w:r>
+      <w:r>
+        <w:rPr>
+          <w:sz w:val="20"/>
+          <w:szCs w:val="20"/>
+        </w:rPr>
+        <w:t xml:space="preserve"> prior written notice, which may include notification via electronic means.</w:t>
       </w:r>
     </w:p>
     <w:p>
@@ -5366,6 +5434,7 @@
           <w:szCs w:val="20"/>
           <w:u w:val="single"/>
         </w:rPr>
+        <w:lastRenderedPageBreak/>
         <w:t>SCHEDULE A</w:t>
       </w:r>
     </w:p>
@@ -5427,6 +5496,7 @@
           <w:szCs w:val="20"/>
         </w:rPr>
       </w:pPr>
+      <w:proofErr w:type="gramStart"/>
       <w:r>
         <w:rPr>
           <w:rFonts w:ascii="Segoe UI Symbol" w:hAnsi="Segoe UI Symbol" w:cs="Segoe UI Symbol"/>
@@ -5434,8 +5504,29 @@
           <w:szCs w:val="20"/>
           <w:highlight w:val="yellow"/>
         </w:rPr>
-        <w:t>{part_a_</w:t>
-      </w:r>
+        <w:t>{part_a_checkbox}</w:t>
+      </w:r>
+      <w:r>
+        <w:rPr>
+          <w:sz w:val="20"/>
+          <w:szCs w:val="20"/>
+        </w:rPr>
+        <w:t xml:space="preserve">  Part</w:t>
+      </w:r>
+      <w:proofErr w:type="gramEnd"/>
+      <w:r>
+        <w:rPr>
+          <w:sz w:val="20"/>
+          <w:szCs w:val="20"/>
+        </w:rPr>
+        <w:t xml:space="preserve"> A – Contract-Based Facility (revolving)     </w:t>
+      </w:r>
+    </w:p>
+    <w:p>
+      <w:pPr>
+        <w:spacing w:line="360" w:lineRule="auto"/>
+        <w:jc w:val="both"/>
+      </w:pPr>
       <w:proofErr w:type="gramStart"/>
       <w:r>
         <w:rPr>
@@ -5444,47 +5535,7 @@
           <w:szCs w:val="20"/>
           <w:highlight w:val="yellow"/>
         </w:rPr>
-        <w:t>checkbox}</w:t>
-      </w:r>
-      <w:r>
-        <w:rPr>
-          <w:sz w:val="20"/>
-          <w:szCs w:val="20"/>
-        </w:rPr>
-        <w:t xml:space="preserve">  Part</w:t>
-      </w:r>
-      <w:proofErr w:type="gramEnd"/>
-      <w:r>
-        <w:rPr>
-          <w:sz w:val="20"/>
-          <w:szCs w:val="20"/>
-        </w:rPr>
-        <w:t xml:space="preserve"> A – Contract-Based Facility (revolving)     </w:t>
-      </w:r>
-    </w:p>
-    <w:p>
-      <w:pPr>
-        <w:spacing w:line="360" w:lineRule="auto"/>
-        <w:jc w:val="both"/>
-      </w:pPr>
-      <w:r>
-        <w:rPr>
-          <w:rFonts w:ascii="Segoe UI Symbol" w:hAnsi="Segoe UI Symbol" w:cs="Segoe UI Symbol"/>
-          <w:sz w:val="20"/>
-          <w:szCs w:val="20"/>
-          <w:highlight w:val="yellow"/>
-        </w:rPr>
-        <w:t>{part_b_</w:t>
-      </w:r>
-      <w:proofErr w:type="gramStart"/>
-      <w:r>
-        <w:rPr>
-          <w:rFonts w:ascii="Segoe UI Symbol" w:hAnsi="Segoe UI Symbol" w:cs="Segoe UI Symbol"/>
-          <w:sz w:val="20"/>
-          <w:szCs w:val="20"/>
-          <w:highlight w:val="yellow"/>
-        </w:rPr>
-        <w:t>checkbox}</w:t>
+        <w:t>{part_b_checkbox}</w:t>
       </w:r>
       <w:r>
         <w:rPr>
@@ -6491,6 +6542,7 @@
           <w:szCs w:val="20"/>
           <w:u w:val="single"/>
         </w:rPr>
+        <w:lastRenderedPageBreak/>
         <w:t>PART B — INVOICE-BASED FINANCING (SINGLE INVOICE)</w:t>
       </w:r>
     </w:p>
@@ -7064,6 +7116,7 @@
                 <w:sz w:val="20"/>
                 <w:szCs w:val="20"/>
               </w:rPr>
+              <w:lastRenderedPageBreak/>
               <w:t>Facility Fee</w:t>
             </w:r>
           </w:p>
@@ -7552,6 +7605,7 @@
                 <w:sz w:val="20"/>
                 <w:szCs w:val="20"/>
               </w:rPr>
+              <w:lastRenderedPageBreak/>
               <w:t>the receivable and the underlying contract (where applicable) are acceptable to the Platform, acting in its sole and absolute discretion.</w:t>
             </w:r>
           </w:p>
@@ -7756,6 +7810,7 @@
           <w:szCs w:val="20"/>
           <w:u w:val="single"/>
         </w:rPr>
+        <w:lastRenderedPageBreak/>
         <w:t>SCHEDULE B</w:t>
       </w:r>
     </w:p>
@@ -7908,7 +7963,21 @@
           <w:sz w:val="20"/>
           <w:szCs w:val="20"/>
         </w:rPr>
-        <w:t>such other letters of award, contracts, invoices, purchase orders or such other agreements between the Issuer and Approved Buyer(s) which is acceptable to SSP, acting in its sole and absolute discretion,</w:t>
+        <w:t xml:space="preserve">such other letters of award, contracts, invoices, purchase orders or such other agreements between the Issuer and Approved </w:t>
+      </w:r>
+      <w:r>
+        <w:rPr>
+          <w:sz w:val="20"/>
+          <w:szCs w:val="20"/>
+        </w:rPr>
+        <w:t>Buyer(s)</w:t>
+      </w:r>
+      <w:r>
+        <w:rPr>
+          <w:sz w:val="20"/>
+          <w:szCs w:val="20"/>
+        </w:rPr>
+        <w:t xml:space="preserve"> which is acceptable to SSP, acting in its sole and absolute discretion,</w:t>
       </w:r>
     </w:p>
     <w:p>
@@ -7981,6 +8050,7 @@
           <w:szCs w:val="20"/>
           <w:u w:val="single"/>
         </w:rPr>
+        <w:lastRenderedPageBreak/>
         <w:t>MEMORANDUM OF ACCEPTANCE</w:t>
       </w:r>
     </w:p>
@@ -8011,8 +8081,8 @@
           <w:bCs/>
           <w:sz w:val="20"/>
           <w:szCs w:val="20"/>
+          <w:u w:val="single"/>
           <w:highlight w:val="yellow"/>
-          <w:u w:val="single"/>
         </w:rPr>
         <w:t>{letter_date}</w:t>
       </w:r>
@@ -8553,7 +8623,15 @@
           <w:sz w:val="20"/>
           <w:szCs w:val="20"/>
         </w:rPr>
-        <w:t>NRIC :</w:t>
+        <w:t xml:space="preserve">NRIC : </w:t>
+      </w:r>
+      <w:r>
+        <w:rPr>
+          <w:sz w:val="20"/>
+          <w:szCs w:val="20"/>
+          <w:highlight w:val="yellow"/>
+        </w:rPr>
+        <w:t>{nric}</w:t>
       </w:r>
     </w:p>
     <w:p>
@@ -8874,75 +8952,10 @@
         <w:rPr>
           <w:sz w:val="20"/>
           <w:szCs w:val="20"/>
-        </w:rPr>
-        <w:t xml:space="preserve">Registration No. </w:t>
-      </w:r>
-      <w:r>
-        <w:rPr>
-          <w:sz w:val="20"/>
-          <w:szCs w:val="20"/>
           <w:highlight w:val="yellow"/>
         </w:rPr>
-        <w:t>{</w:t>
-      </w:r>
-      <w:proofErr w:type="spellStart"/>
-      <w:r>
-        <w:rPr>
-          <w:sz w:val="20"/>
-          <w:szCs w:val="20"/>
-          <w:highlight w:val="yellow"/>
-        </w:rPr>
-        <w:t>company_ssm</w:t>
-      </w:r>
-      <w:proofErr w:type="spellEnd"/>
-      <w:r>
-        <w:rPr>
-          <w:sz w:val="20"/>
-          <w:szCs w:val="20"/>
-          <w:highlight w:val="yellow"/>
-        </w:rPr>
-        <w:t>}</w:t>
-      </w:r>
-    </w:p>
-    <w:p>
-      <w:pPr>
-        <w:spacing w:line="360" w:lineRule="auto"/>
-        <w:jc w:val="both"/>
-        <w:rPr>
-          <w:sz w:val="20"/>
-          <w:szCs w:val="20"/>
-        </w:rPr>
-      </w:pPr>
-    </w:p>
-    <w:p>
-      <w:pPr>
-        <w:spacing w:line="360" w:lineRule="auto"/>
-        <w:jc w:val="both"/>
-        <w:rPr>
-          <w:sz w:val="20"/>
-          <w:szCs w:val="20"/>
-        </w:rPr>
-      </w:pPr>
-    </w:p>
-    <w:p>
-      <w:pPr>
-        <w:spacing w:line="360" w:lineRule="auto"/>
-        <w:jc w:val="both"/>
-        <w:rPr>
-          <w:sz w:val="20"/>
-          <w:szCs w:val="20"/>
-        </w:rPr>
-      </w:pPr>
-    </w:p>
-    <w:p>
-      <w:pPr>
-        <w:spacing w:line="360" w:lineRule="auto"/>
-        <w:jc w:val="both"/>
-        <w:rPr>
-          <w:sz w:val="20"/>
-          <w:szCs w:val="20"/>
-        </w:rPr>
-      </w:pPr>
+        <w:t>{company_ssm}</w:t>
+      </w:r>
     </w:p>
     <w:tbl>
       <w:tblPr>
@@ -8955,6 +8968,9 @@
         <w:gridCol w:w="4513"/>
       </w:tblGrid>
       <w:tr>
+        <w:trPr>
+          <w:cantSplit/>
+        </w:trPr>
         <w:tc>
           <w:tcPr>
             <w:tcW w:w="4675" w:type="dxa"/>
@@ -8974,13 +8990,6 @@
                 <w:szCs w:val="20"/>
               </w:rPr>
             </w:pPr>
-            <w:r>
-              <w:rPr>
-                <w:sz w:val="20"/>
-                <w:szCs w:val="20"/>
-              </w:rPr>
-              <w:t>{#signatory_rows}</w:t>
-            </w:r>
           </w:p>
           <w:p>
             <w:pPr>
@@ -8991,13 +9000,6 @@
                 <w:szCs w:val="20"/>
               </w:rPr>
             </w:pPr>
-            <w:r>
-              <w:rPr>
-                <w:sz w:val="20"/>
-                <w:szCs w:val="20"/>
-              </w:rPr>
-              <w:t>______________________________</w:t>
-            </w:r>
           </w:p>
           <w:p>
             <w:pPr>
@@ -9008,6 +9010,33 @@
                 <w:szCs w:val="20"/>
               </w:rPr>
             </w:pPr>
+          </w:p>
+          <w:p>
+            <w:pPr>
+              <w:spacing w:line="360" w:lineRule="auto"/>
+              <w:jc w:val="both"/>
+              <w:rPr>
+                <w:sz w:val="20"/>
+                <w:szCs w:val="20"/>
+              </w:rPr>
+            </w:pPr>
+            <w:r>
+              <w:rPr>
+                <w:sz w:val="20"/>
+                <w:szCs w:val="20"/>
+              </w:rPr>
+              <w:t>{#signatory_rows}______________________________</w:t>
+            </w:r>
+          </w:p>
+          <w:p>
+            <w:pPr>
+              <w:spacing w:line="360" w:lineRule="auto"/>
+              <w:jc w:val="both"/>
+              <w:rPr>
+                <w:sz w:val="20"/>
+                <w:szCs w:val="20"/>
+              </w:rPr>
+            </w:pPr>
             <w:r>
               <w:rPr>
                 <w:sz w:val="20"/>
@@ -9031,7 +9060,15 @@
                 <w:sz w:val="20"/>
                 <w:szCs w:val="20"/>
               </w:rPr>
-              <w:t>NRIC :</w:t>
+              <w:t xml:space="preserve">NRIC : </w:t>
+            </w:r>
+            <w:r>
+              <w:rPr>
+                <w:sz w:val="20"/>
+                <w:szCs w:val="20"/>
+                <w:highlight w:val="yellow"/>
+              </w:rPr>
+              <w:t>{left_nric}</w:t>
             </w:r>
           </w:p>
           <w:p>
@@ -9071,13 +9108,6 @@
                 <w:szCs w:val="20"/>
               </w:rPr>
             </w:pPr>
-            <w:r>
-              <w:rPr>
-                <w:sz w:val="20"/>
-                <w:szCs w:val="20"/>
-              </w:rPr>
-              <w:t>{#show_right}</w:t>
-            </w:r>
           </w:p>
           <w:p>
             <w:pPr>
@@ -9088,13 +9118,6 @@
                 <w:szCs w:val="20"/>
               </w:rPr>
             </w:pPr>
-            <w:r>
-              <w:rPr>
-                <w:sz w:val="20"/>
-                <w:szCs w:val="20"/>
-              </w:rPr>
-              <w:t>______________________________</w:t>
-            </w:r>
           </w:p>
           <w:p>
             <w:pPr>
@@ -9105,6 +9128,33 @@
                 <w:szCs w:val="20"/>
               </w:rPr>
             </w:pPr>
+          </w:p>
+          <w:p>
+            <w:pPr>
+              <w:spacing w:line="360" w:lineRule="auto"/>
+              <w:jc w:val="both"/>
+              <w:rPr>
+                <w:sz w:val="20"/>
+                <w:szCs w:val="20"/>
+              </w:rPr>
+            </w:pPr>
+            <w:r>
+              <w:rPr>
+                <w:sz w:val="20"/>
+                <w:szCs w:val="20"/>
+              </w:rPr>
+              <w:t>{#show_right}______________________________</w:t>
+            </w:r>
+          </w:p>
+          <w:p>
+            <w:pPr>
+              <w:spacing w:line="360" w:lineRule="auto"/>
+              <w:jc w:val="both"/>
+              <w:rPr>
+                <w:sz w:val="20"/>
+                <w:szCs w:val="20"/>
+              </w:rPr>
+            </w:pPr>
             <w:r>
               <w:rPr>
                 <w:sz w:val="20"/>
@@ -9128,7 +9178,15 @@
                 <w:sz w:val="20"/>
                 <w:szCs w:val="20"/>
               </w:rPr>
-              <w:t>NRIC :</w:t>
+              <w:t xml:space="preserve">NRIC : </w:t>
+            </w:r>
+            <w:r>
+              <w:rPr>
+                <w:sz w:val="20"/>
+                <w:szCs w:val="20"/>
+                <w:highlight w:val="yellow"/>
+              </w:rPr>
+              <w:t>{right_nric}</w:t>
             </w:r>
           </w:p>
           <w:p>
@@ -9145,41 +9203,7 @@
                 <w:sz w:val="20"/>
                 <w:szCs w:val="20"/>
               </w:rPr>
-              <w:t>Designation :</w:t>
-            </w:r>
-          </w:p>
-          <w:p>
-            <w:pPr>
-              <w:spacing w:line="360" w:lineRule="auto"/>
-              <w:jc w:val="both"/>
-              <w:rPr>
-                <w:sz w:val="20"/>
-                <w:szCs w:val="20"/>
-              </w:rPr>
-            </w:pPr>
-            <w:r>
-              <w:rPr>
-                <w:sz w:val="20"/>
-                <w:szCs w:val="20"/>
-              </w:rPr>
-              <w:t>{/show_right}</w:t>
-            </w:r>
-          </w:p>
-          <w:p>
-            <w:pPr>
-              <w:spacing w:line="360" w:lineRule="auto"/>
-              <w:jc w:val="both"/>
-              <w:rPr>
-                <w:sz w:val="20"/>
-                <w:szCs w:val="20"/>
-              </w:rPr>
-            </w:pPr>
-            <w:r>
-              <w:rPr>
-                <w:sz w:val="20"/>
-                <w:szCs w:val="20"/>
-              </w:rPr>
-              <w:t>{/signatory_rows}</w:t>
+              <w:t>Designation :{/show_right}{/signatory_rows}</w:t>
             </w:r>
           </w:p>
         </w:tc>
@@ -9262,6 +9286,7 @@
           <w:sz w:val="20"/>
           <w:szCs w:val="20"/>
         </w:rPr>
+        <w:lastRenderedPageBreak/>
         <w:t>ANNEXURE : GENERAL TERMS AND CONDITIONS</w:t>
       </w:r>
     </w:p>
@@ -9522,7 +9547,15 @@
           <w:sz w:val="20"/>
           <w:szCs w:val="20"/>
         </w:rPr>
-        <w:t>All information provided by you in connection with the facility(ies) is complete, accurate, and does not omit any material facts that would make any statements made by you misleading. Furthermore, all representations of expectation, intention, belief, and opinion made by you have been made in good faith, on reasonable grounds, and following due and proper inquiry.</w:t>
+        <w:t xml:space="preserve">All information provided by you in connection with the facility(ies) is complete, accurate, and does not omit any material facts that would make any statements made by you misleading. </w:t>
+      </w:r>
+      <w:r>
+        <w:rPr>
+          <w:sz w:val="20"/>
+          <w:szCs w:val="20"/>
+        </w:rPr>
+        <w:lastRenderedPageBreak/>
+        <w:t>Furthermore, all representations of expectation, intention, belief, and opinion made by you have been made in good faith, on reasonable grounds, and following due and proper inquiry.</w:t>
       </w:r>
     </w:p>
     <w:p>
@@ -9869,6 +9902,7 @@
           <w:sz w:val="20"/>
           <w:szCs w:val="20"/>
         </w:rPr>
+        <w:lastRenderedPageBreak/>
         <w:t>Provide SSP with your audited financial statements for each of your financial periods, which shall contain an income statement and balance sheet, audited and certified by an independent firm of accountants, within six (6) months after the end of each period.</w:t>
       </w:r>
     </w:p>
@@ -10150,6 +10184,7 @@
           <w:sz w:val="20"/>
           <w:szCs w:val="20"/>
         </w:rPr>
+        <w:lastRenderedPageBreak/>
         <w:t>Notification of Changes in Signatories: Notify SSP if any of your authorized signatories are no longer authorized to sign or act on your behalf under this Letter of Offer.</w:t>
       </w:r>
     </w:p>
@@ -10545,6 +10580,7 @@
           <w:sz w:val="20"/>
           <w:szCs w:val="20"/>
         </w:rPr>
+        <w:lastRenderedPageBreak/>
         <w:t>Creation of Liens: Create or permit any lien or encumbrance on any of your assets, except for tax or statutory liens that are discharged within thirty (30) days of final adjudication, security granted in the ordinary course of business in connection with other financing and any security which does not materially prejudice the interests of the investors. "Lien" includes any assignment, mortgage, pledge, charge, privilege, encumbrance, or priority, and "assets" include any rights, receivables, or property, whether movable or immovable, present or future.</w:t>
       </w:r>
       <w:r>
@@ -10846,7 +10882,15 @@
           <w:sz w:val="20"/>
           <w:szCs w:val="20"/>
         </w:rPr>
-        <w:t>Notwithstanding any provisions herein regarding repayment of the facility(ies), SSP reserves the right to cancel the facility(ies), or any part thereof, whereupon all principal, advances, late payment charges, and all other sums owed to SSP and/or Investors, secured by any security, shall be immediately repayable upon demand. SSP may also withdraw any sums payable by you to SSP and/or Investors from your account under the following circumstances:</w:t>
+        <w:t xml:space="preserve">Notwithstanding any provisions herein regarding repayment of the facility(ies), SSP reserves the right to cancel the facility(ies), or any part thereof, whereupon all principal, advances, late payment charges, </w:t>
+      </w:r>
+      <w:r>
+        <w:rPr>
+          <w:sz w:val="20"/>
+          <w:szCs w:val="20"/>
+        </w:rPr>
+        <w:lastRenderedPageBreak/>
+        <w:t>and all other sums owed to SSP and/or Investors, secured by any security, shall be immediately repayable upon demand. SSP may also withdraw any sums payable by you to SSP and/or Investors from your account under the following circumstances:</w:t>
       </w:r>
     </w:p>
     <w:p>
@@ -11145,6 +11189,7 @@
           <w:sz w:val="20"/>
           <w:szCs w:val="20"/>
         </w:rPr>
+        <w:lastRenderedPageBreak/>
         <w:t>Bad Cheque Listing: You are listed as a bad cheque offender by the Dishonoured Cheques Information System maintained by Bank Negara Malaysia (“BNM”).</w:t>
       </w:r>
     </w:p>
@@ -11433,6 +11478,7 @@
           <w:sz w:val="20"/>
           <w:szCs w:val="20"/>
         </w:rPr>
+        <w:lastRenderedPageBreak/>
         <w:t>Appointment of Insolvency Professional: A manager, trustee, nominee, supervisor, judicial manager, custodian, liquidator (provisional or otherwise), receiver, or similar person is appointed in respect of all or part of your business or assets or that of your guarantor or any Security Party.</w:t>
       </w:r>
     </w:p>
@@ -11776,6 +11822,7 @@
           <w:szCs w:val="20"/>
           <w:lang w:val="en-US"/>
         </w:rPr>
+        <w:lastRenderedPageBreak/>
         <w:t>RECOVERY COSTS</w:t>
       </w:r>
     </w:p>
@@ -12180,6 +12227,7 @@
           <w:szCs w:val="20"/>
           <w:lang w:val="en-US"/>
         </w:rPr>
+        <w:lastRenderedPageBreak/>
         <w:t>Notwithstanding the Late Payment Charges (Ta’widh) charged, it is expressly acknowledged and agreed that the amount of Late Payment Charges (Ta’widh) shall not be further compounded.</w:t>
       </w:r>
     </w:p>
@@ -12644,7 +12692,16 @@
           <w:szCs w:val="20"/>
           <w:lang w:val="en-US"/>
         </w:rPr>
-        <w:t>This Letter of Offer shall be governed by and construed in accordance with the applicable laws of Malaysia in all matters relating to the obligations and liabilities of the parties under this Letter of Offer. The parties hereby submit to the exclusive jurisdiction of the courts of Malaysia; however, such submission shall not limit the right of SSP to initiate proceedings in any other jurisdiction. SSP may, at its discretion, initiate actions, proceedings, or otherwise take legal action against the Issuer in Malaysia and/or elsewhere, or concurrently in multiple jurisdictions, as SSP deems appropriate.</w:t>
+        <w:t xml:space="preserve">This Letter of Offer shall be governed by and construed in accordance with the applicable laws of Malaysia in all matters relating to the obligations and liabilities of the parties under this Letter </w:t>
+      </w:r>
+      <w:r>
+        <w:rPr>
+          <w:sz w:val="20"/>
+          <w:szCs w:val="20"/>
+          <w:lang w:val="en-US"/>
+        </w:rPr>
+        <w:lastRenderedPageBreak/>
+        <w:t>of Offer. The parties hereby submit to the exclusive jurisdiction of the courts of Malaysia; however, such submission shall not limit the right of SSP to initiate proceedings in any other jurisdiction. SSP may, at its discretion, initiate actions, proceedings, or otherwise take legal action against the Issuer in Malaysia and/or elsewhere, or concurrently in multiple jurisdictions, as SSP deems appropriate.</w:t>
       </w:r>
     </w:p>
     <w:p>
@@ -12897,6 +12954,7 @@
           <w:szCs w:val="20"/>
           <w:lang w:val="en-US"/>
         </w:rPr>
+        <w:lastRenderedPageBreak/>
         <w:t>The Issuer may not assign or transfer any of its rights or obligations under the Facility without the prior written consent of SSP.</w:t>
       </w:r>
     </w:p>
@@ -13453,6 +13511,7 @@
           <w:szCs w:val="20"/>
           <w:lang w:val="en-US"/>
         </w:rPr>
+        <w:lastRenderedPageBreak/>
         <w:t>RIGHTS OF SSP</w:t>
       </w:r>
     </w:p>
@@ -13748,7 +13807,16 @@
           <w:szCs w:val="20"/>
           <w:lang w:val="en-US"/>
         </w:rPr>
-        <w:t>SSP’s obligation to continue providing the facility(ies) to you, subject to the terms and conditions herein and provided there is no default on your part, shall be contingent upon the absence of any changes in circumstances that may materially affect SSP’s or Investors' ability to provide the facility(ies) or that may result in an increase in the costs incurred by SSP or Investors in doing so.</w:t>
+        <w:t xml:space="preserve">SSP’s obligation to continue providing the facility(ies) to you, subject to the terms and conditions herein and provided there is no default on your part, shall be contingent upon the absence of any changes in circumstances that may materially affect SSP’s or Investors' ability to provide the </w:t>
+      </w:r>
+      <w:r>
+        <w:rPr>
+          <w:sz w:val="20"/>
+          <w:szCs w:val="20"/>
+          <w:lang w:val="en-US"/>
+        </w:rPr>
+        <w:lastRenderedPageBreak/>
+        <w:t>facility(ies) or that may result in an increase in the costs incurred by SSP or Investors in doing so.</w:t>
       </w:r>
     </w:p>
     <w:p>
@@ -14048,7 +14116,16 @@
           <w:szCs w:val="20"/>
           <w:lang w:val="en-US"/>
         </w:rPr>
-        <w:t>SSP’s rights under this Facility are cumulative and may be exercised as often as deemed appropriate, in addition to any rights under applicable law. These rights cannot be waived or varied except by express written agreement. Failure or delay in exercising any right does not constitute a waiver, and any partial exercise of a right does not preclude further exercise of that right. No conduct or negotiation by SSP or Investors shall suspend or vary any right.</w:t>
+        <w:t xml:space="preserve">SSP’s rights under this Facility are cumulative and may be exercised as often as deemed appropriate, in addition to any rights under applicable law. These rights cannot be waived or varied except by express written agreement. Failure or delay in exercising any right does not </w:t>
+      </w:r>
+      <w:r>
+        <w:rPr>
+          <w:sz w:val="20"/>
+          <w:szCs w:val="20"/>
+          <w:lang w:val="en-US"/>
+        </w:rPr>
+        <w:lastRenderedPageBreak/>
+        <w:t>constitute a waiver, and any partial exercise of a right does not preclude further exercise of that right. No conduct or negotiation by SSP or Investors shall suspend or vary any right.</w:t>
       </w:r>
     </w:p>
     <w:p>
@@ -14455,6 +14532,7 @@
           <w:szCs w:val="20"/>
           <w:lang w:val="en-US"/>
         </w:rPr>
+        <w:lastRenderedPageBreak/>
         <w:t>STRATEGIC TRADE ACT 2010</w:t>
       </w:r>
     </w:p>
@@ -14772,6 +14850,7 @@
           <w:szCs w:val="20"/>
           <w:lang w:val="en-US"/>
         </w:rPr>
+        <w:lastRenderedPageBreak/>
         <w:t>PERSONAL DATA PROTECTION ACT 2010</w:t>
       </w:r>
     </w:p>
@@ -15139,6 +15218,7 @@
           <w:szCs w:val="20"/>
           <w:lang w:val="en-US"/>
         </w:rPr>
+        <w:lastRenderedPageBreak/>
         <w:t>Each party ensures that its employees, agents, or any third parties acting on its behalf will not commit or procure any Prohibited Act. Any request for bribes or inducements must be promptly reported to the other party.</w:t>
       </w:r>
     </w:p>
@@ -15612,6 +15692,7 @@
           <w:szCs w:val="20"/>
           <w:lang w:val="en-US"/>
         </w:rPr>
+        <w:lastRenderedPageBreak/>
         <w:t>In the event of default by the Issuer, SSP shall have the right to immediately enforce its rights under the security documents to recover all sums owing under the security documents.</w:t>
       </w:r>
     </w:p>
@@ -15943,6 +16024,7 @@
           <w:szCs w:val="20"/>
           <w:lang w:val="en-US"/>
         </w:rPr>
+        <w:lastRenderedPageBreak/>
         <w:t>Concurrent Proceedings</w:t>
       </w:r>
     </w:p>
@@ -16017,12 +16099,12 @@
       </w:r>
     </w:p>
     <w:sectPr>
-      <w:headerReference w:type="even" r:id="rId12"/>
-      <w:headerReference w:type="default" r:id="rId13"/>
-      <w:footerReference w:type="even" r:id="rId14"/>
-      <w:footerReference w:type="default" r:id="rId15"/>
-      <w:headerReference w:type="first" r:id="rId16"/>
-      <w:footerReference w:type="first" r:id="rId17"/>
+      <w:headerReference w:type="even" r:id="rId16"/>
+      <w:headerReference w:type="default" r:id="rId12"/>
+      <w:footerReference w:type="even" r:id="rId17"/>
+      <w:footerReference w:type="default" r:id="rId13"/>
+      <w:headerReference w:type="first" r:id="rId18"/>
+      <w:footerReference w:type="first" r:id="rId19"/>
       <w:footnotePr>
         <w:numFmt w:val="chicago"/>
         <w:numRestart w:val="eachPage"/>
@@ -19039,7 +19121,7 @@
         <w:ind w:left="1180" w:hanging="360"/>
       </w:pPr>
     </w:lvl>
-    <w:lvl w:ilvl="1" w:tplc="04090019">
+    <w:lvl w:ilvl="1" w:tplc="04090019" w:tentative="1">
       <w:start w:val="1"/>
       <w:numFmt w:val="lowerLetter"/>
       <w:lvlText w:val="%2."/>
@@ -23863,18 +23945,6 @@
 </file>
 
 <file path=customXml/item1.xml><?xml version="1.0" encoding="utf-8"?>
-<p:properties xmlns:p="http://schemas.microsoft.com/office/2006/metadata/properties" xmlns:xsi="http://www.w3.org/2001/XMLSchema-instance" xmlns:pc="http://schemas.microsoft.com/office/infopath/2007/PartnerControls">
-  <documentManagement>
-    <_Flow_SignoffStatus xmlns="a0846abc-da76-433d-b89e-11ed84fbaeb3" xsi:nil="true"/>
-    <lcf76f155ced4ddcb4097134ff3c332f xmlns="a0846abc-da76-433d-b89e-11ed84fbaeb3">
-      <Terms xmlns="http://schemas.microsoft.com/office/infopath/2007/PartnerControls"/>
-    </lcf76f155ced4ddcb4097134ff3c332f>
-    <TaxCatchAll xmlns="4b0b2adc-e4a8-4832-bb38-e3a7e820179b" xsi:nil="true"/>
-  </documentManagement>
-</p:properties>
-</file>
-
-<file path=customXml/item2.xml><?xml version="1.0" encoding="utf-8"?>
 <ct:contentTypeSchema xmlns:ct="http://schemas.microsoft.com/office/2006/metadata/contentType" xmlns:ma="http://schemas.microsoft.com/office/2006/metadata/properties/metaAttributes" ct:_="" ma:_="" ma:contentTypeName="Document" ma:contentTypeID="0x010100095F958C9057D64E8725F7631168A218" ma:contentTypeVersion="24" ma:contentTypeDescription="Create a new document." ma:contentTypeScope="" ma:versionID="0181d0ef269031616f304220f34fcec3">
   <xsd:schema xmlns:xsd="http://www.w3.org/2001/XMLSchema" xmlns:xs="http://www.w3.org/2001/XMLSchema" xmlns:p="http://schemas.microsoft.com/office/2006/metadata/properties" xmlns:ns2="a0846abc-da76-433d-b89e-11ed84fbaeb3" xmlns:ns3="4b0b2adc-e4a8-4832-bb38-e3a7e820179b" targetNamespace="http://schemas.microsoft.com/office/2006/metadata/properties" ma:root="true" ma:fieldsID="8fea1687251d818162f479617e9b8afa" ns2:_="" ns3:_="">
     <xsd:import namespace="a0846abc-da76-433d-b89e-11ed84fbaeb3"/>
@@ -24141,7 +24211,7 @@
 </ct:contentTypeSchema>
 </file>
 
-<file path=customXml/item3.xml><?xml version="1.0" encoding="utf-8"?>
+<file path=customXml/item2.xml><?xml version="1.0" encoding="utf-8"?>
 <?mso-contentType ?>
 <FormTemplates xmlns="http://schemas.microsoft.com/sharepoint/v3/contenttype/forms">
   <Display>DocumentLibraryForm</Display>
@@ -24150,22 +24220,23 @@
 </FormTemplates>
 </file>
 
-<file path=customXml/item4.xml><?xml version="1.0" encoding="utf-8"?>
+<file path=customXml/item3.xml><?xml version="1.0" encoding="utf-8"?>
 <b:Sources xmlns:b="http://schemas.openxmlformats.org/officeDocument/2006/bibliography" xmlns="http://schemas.openxmlformats.org/officeDocument/2006/bibliography" SelectedStyle="\APASixthEditionOfficeOnline.xsl" StyleName="APA" Version="6"/>
 </file>
 
-<file path=customXml/itemProps1.xml><?xml version="1.0" encoding="utf-8"?>
-<ds:datastoreItem xmlns:ds="http://schemas.openxmlformats.org/officeDocument/2006/customXml" ds:itemID="{06AF3FC3-CD02-49E6-93A5-73EE653BBDCC}">
-  <ds:schemaRefs>
-    <ds:schemaRef ds:uri="http://schemas.microsoft.com/office/2006/metadata/properties"/>
-    <ds:schemaRef ds:uri="http://schemas.microsoft.com/office/infopath/2007/PartnerControls"/>
-    <ds:schemaRef ds:uri="a0846abc-da76-433d-b89e-11ed84fbaeb3"/>
-    <ds:schemaRef ds:uri="4b0b2adc-e4a8-4832-bb38-e3a7e820179b"/>
-  </ds:schemaRefs>
-</ds:datastoreItem>
+<file path=customXml/item4.xml><?xml version="1.0" encoding="utf-8"?>
+<p:properties xmlns:p="http://schemas.microsoft.com/office/2006/metadata/properties" xmlns:xsi="http://www.w3.org/2001/XMLSchema-instance" xmlns:pc="http://schemas.microsoft.com/office/infopath/2007/PartnerControls">
+  <documentManagement>
+    <_Flow_SignoffStatus xmlns="a0846abc-da76-433d-b89e-11ed84fbaeb3" xsi:nil="true"/>
+    <lcf76f155ced4ddcb4097134ff3c332f xmlns="a0846abc-da76-433d-b89e-11ed84fbaeb3">
+      <Terms xmlns="http://schemas.microsoft.com/office/infopath/2007/PartnerControls"/>
+    </lcf76f155ced4ddcb4097134ff3c332f>
+    <TaxCatchAll xmlns="4b0b2adc-e4a8-4832-bb38-e3a7e820179b" xsi:nil="true"/>
+  </documentManagement>
+</p:properties>
 </file>
 
-<file path=customXml/itemProps2.xml><?xml version="1.0" encoding="utf-8"?>
+<file path=customXml/itemProps1.xml><?xml version="1.0" encoding="utf-8"?>
 <ds:datastoreItem xmlns:ds="http://schemas.openxmlformats.org/officeDocument/2006/customXml" ds:itemID="{F20D8333-D2CC-42A6-B516-87CB1D2A20AC}">
   <ds:schemaRefs>
     <ds:schemaRef ds:uri="http://schemas.microsoft.com/office/2006/metadata/contentType"/>
@@ -24184,7 +24255,7 @@
 </ds:datastoreItem>
 </file>
 
-<file path=customXml/itemProps3.xml><?xml version="1.0" encoding="utf-8"?>
+<file path=customXml/itemProps2.xml><?xml version="1.0" encoding="utf-8"?>
 <ds:datastoreItem xmlns:ds="http://schemas.openxmlformats.org/officeDocument/2006/customXml" ds:itemID="{B3B23335-743F-4ECA-B591-0D88F7E33FD2}">
   <ds:schemaRefs>
     <ds:schemaRef ds:uri="http://schemas.microsoft.com/sharepoint/v3/contenttype/forms"/>
@@ -24192,10 +24263,21 @@
 </ds:datastoreItem>
 </file>
 
-<file path=customXml/itemProps4.xml><?xml version="1.0" encoding="utf-8"?>
+<file path=customXml/itemProps3.xml><?xml version="1.0" encoding="utf-8"?>
 <ds:datastoreItem xmlns:ds="http://schemas.openxmlformats.org/officeDocument/2006/customXml" ds:itemID="{31A8F991-F2C3-4A98-93A0-9F15F02E83A7}">
   <ds:schemaRefs>
     <ds:schemaRef ds:uri="http://schemas.openxmlformats.org/officeDocument/2006/bibliography"/>
   </ds:schemaRefs>
 </ds:datastoreItem>
+</file>
+
+<file path=customXml/itemProps4.xml><?xml version="1.0" encoding="utf-8"?>
+<ds:datastoreItem xmlns:ds="http://schemas.openxmlformats.org/officeDocument/2006/customXml" ds:itemID="{06AF3FC3-CD02-49E6-93A5-73EE653BBDCC}">
+  <ds:schemaRefs>
+    <ds:schemaRef ds:uri="http://schemas.microsoft.com/office/2006/metadata/properties"/>
+    <ds:schemaRef ds:uri="http://schemas.microsoft.com/office/infopath/2007/PartnerControls"/>
+    <ds:schemaRef ds:uri="a0846abc-da76-433d-b89e-11ed84fbaeb3"/>
+    <ds:schemaRef ds:uri="4b0b2adc-e4a8-4832-bb38-e3a7e820179b"/>
+  </ds:schemaRefs>
+</ds:datastoreItem>
 </file>
</xml_diff>

<commit_message>
feat: guarantors are now locked at the facility level
- Updated some spacing and formatting in the LO template
</commit_message>
<xml_diff>
--- a/apps/api/src/modules/applications/templates/arf-contract-facility-lo.docx
+++ b/apps/api/src/modules/applications/templates/arf-contract-facility-lo.docx
@@ -30,12 +30,6 @@
           <w:szCs w:val="20"/>
         </w:rPr>
         <w:tab/>
-      </w:r>
-      <w:r>
-        <w:rPr>
-          <w:sz w:val="20"/>
-          <w:szCs w:val="20"/>
-        </w:rPr>
         <w:t xml:space="preserve">: </w:t>
       </w:r>
       <w:r>
@@ -75,12 +69,6 @@
           <w:szCs w:val="20"/>
         </w:rPr>
         <w:tab/>
-      </w:r>
-      <w:r>
-        <w:rPr>
-          <w:sz w:val="20"/>
-          <w:szCs w:val="20"/>
-        </w:rPr>
         <w:t xml:space="preserve">: </w:t>
       </w:r>
       <w:r>
@@ -127,12 +115,6 @@
           <w:szCs w:val="20"/>
         </w:rPr>
         <w:tab/>
-      </w:r>
-      <w:r>
-        <w:rPr>
-          <w:sz w:val="20"/>
-          <w:szCs w:val="20"/>
-        </w:rPr>
         <w:t xml:space="preserve">: </w:t>
       </w:r>
       <w:r>
@@ -297,6 +279,7 @@
     <w:p>
       <w:pPr>
         <w:spacing w:after="0" w:line="360" w:lineRule="auto"/>
+        <w:ind w:left="720" w:firstLine="720"/>
         <w:rPr>
           <w:sz w:val="20"/>
           <w:szCs w:val="20"/>
@@ -499,9 +482,9 @@
         <w:tblLook w:val="04A0" w:firstRow="1" w:lastRow="0" w:firstColumn="1" w:lastColumn="0" w:noHBand="0" w:noVBand="1"/>
       </w:tblPr>
       <w:tblGrid>
-        <w:gridCol w:w="2929"/>
-        <w:gridCol w:w="398"/>
-        <w:gridCol w:w="5699"/>
+        <w:gridCol w:w="2917"/>
+        <w:gridCol w:w="397"/>
+        <w:gridCol w:w="5712"/>
       </w:tblGrid>
       <w:tr>
         <w:trPr>
@@ -964,7 +947,15 @@
                 <w:sz w:val="20"/>
                 <w:szCs w:val="20"/>
               </w:rPr>
-              <w:t xml:space="preserve">The Financing Limit represents the maximum aggregate amount approved by the SSP and/or Platform for potential utilisation under this Facility. </w:t>
+              <w:t xml:space="preserve">The Financing Limit represents the maximum </w:t>
+            </w:r>
+            <w:r>
+              <w:rPr>
+                <w:sz w:val="20"/>
+                <w:szCs w:val="20"/>
+              </w:rPr>
+              <w:lastRenderedPageBreak/>
+              <w:t xml:space="preserve">aggregate amount approved by the SSP and/or Platform for potential utilisation under this Facility. </w:t>
             </w:r>
           </w:p>
           <w:p>
@@ -1004,7 +995,6 @@
                 <w:sz w:val="20"/>
                 <w:szCs w:val="20"/>
               </w:rPr>
-              <w:lastRenderedPageBreak/>
               <w:t>the approval of the Financing Limit does not create any obligation on the Issuer to utilise the Facility in full or in part;</w:t>
             </w:r>
           </w:p>
@@ -1363,7 +1353,15 @@
                 <w:sz w:val="20"/>
                 <w:szCs w:val="20"/>
               </w:rPr>
-              <w:t xml:space="preserve">Such annual profit rate as may be determined by the Operator in accordance with the paragraph below, per annum calculated on a daily basis (actual/365), within the range of eight per cent (8%) to eighteen per cent (18%) per annum, and subject at all times to the Balance Margin of Financing. </w:t>
+              <w:t xml:space="preserve">Such annual profit rate as may be determined by the Operator in accordance with the paragraph below, per annum calculated on a daily basis (actual/365), within the range of eight per cent </w:t>
+            </w:r>
+            <w:r>
+              <w:rPr>
+                <w:sz w:val="20"/>
+                <w:szCs w:val="20"/>
+              </w:rPr>
+              <w:lastRenderedPageBreak/>
+              <w:t xml:space="preserve">(8%) to eighteen per cent (18%) per annum, and subject at all times to the Balance Margin of Financing. </w:t>
             </w:r>
           </w:p>
           <w:p>
@@ -1390,15 +1388,7 @@
                 <w:sz w:val="20"/>
                 <w:szCs w:val="20"/>
               </w:rPr>
-              <w:t xml:space="preserve">Determination of profit rate: The annual profit rate applicable to each Utilization shall be determined separately by the Operator before that Utilization is offered or listed as an Investment Note </w:t>
-            </w:r>
-            <w:r>
-              <w:rPr>
-                <w:sz w:val="20"/>
-                <w:szCs w:val="20"/>
-              </w:rPr>
-              <w:lastRenderedPageBreak/>
-              <w:t>on the Platform. In determining the proposed rate, the Operator may consider the Issuer’s current risk assessment, payment history, the relevant Customer or Approved Paymaster, the characteristics and age of the Receivable, the requested tenure, prevailing market conditions, investor demand and return expectations, available funding, and the Operator’s applicable credit and pricing policies. The annual profit rate for a Utilization shall not exceed eighteen per cent (18%) per annum, or such lower maximum as may be prescribed under applicable laws, regulatory requirements or the Platform Rules.</w:t>
+              <w:t>Determination of profit rate: The annual profit rate applicable to each Utilization shall be determined separately by the Operator before that Utilization is offered or listed as an Investment Note on the Platform. In determining the proposed rate, the Operator may consider the Issuer’s current risk assessment, payment history, the relevant Customer or Approved Paymaster, the characteristics and age of the Receivable, the requested tenure, prevailing market conditions, investor demand and return expectations, available funding, and the Operator’s applicable credit and pricing policies. The annual profit rate for a Utilization shall not exceed eighteen per cent (18%) per annum, or such lower maximum as may be prescribed under applicable laws, regulatory requirements or the Platform Rules.</w:t>
             </w:r>
           </w:p>
           <w:p>
@@ -1716,29 +1706,7 @@
                 <w:sz w:val="20"/>
                 <w:szCs w:val="20"/>
               </w:rPr>
-              <w:t xml:space="preserve">The first utilisation of the Facility shall be made </w:t>
-            </w:r>
-            <w:r>
-              <w:rPr>
-                <w:sz w:val="20"/>
-                <w:szCs w:val="20"/>
-              </w:rPr>
-              <w:t>within thirty (30) days</w:t>
-            </w:r>
-            <w:r>
-              <w:rPr>
-                <w:sz w:val="20"/>
-                <w:szCs w:val="20"/>
-              </w:rPr>
-              <w:t xml:space="preserve"> from the date of acceptance of this Letter of Offer, failing which SSP reserves </w:t>
-            </w:r>
-            <w:r>
-              <w:rPr>
-                <w:sz w:val="20"/>
-                <w:szCs w:val="20"/>
-              </w:rPr>
-              <w:lastRenderedPageBreak/>
-              <w:t xml:space="preserve">the right to cancel or withdraw the Facility without further notice. </w:t>
+              <w:t xml:space="preserve">The first utilisation of the Facility shall be made within thirty (30) days from the date of acceptance of this Letter of Offer, failing which SSP reserves the right to cancel or withdraw the Facility without further notice. </w:t>
             </w:r>
           </w:p>
           <w:p>
@@ -2082,7 +2050,6 @@
                 <w:numId w:val="4"/>
               </w:numPr>
               <w:spacing w:line="360" w:lineRule="auto"/>
-              <w:ind w:left="1900" w:hanging="360"/>
               <w:jc w:val="both"/>
               <w:rPr>
                 <w:sz w:val="20"/>
@@ -2187,7 +2154,15 @@
                 <w:sz w:val="20"/>
                 <w:szCs w:val="20"/>
               </w:rPr>
-              <w:t>Such other documents or instruments as may from time to time be required by SSP, in form and substance acceptable to the SSP, to further secure the payment obligations of the Issuer under the Purchase Price arising from each  utilisation of the Facility(ies).</w:t>
+              <w:t xml:space="preserve">Such other documents or instruments as may from time to time be required by SSP, in form and substance acceptable to the SSP, to further secure the payment </w:t>
+            </w:r>
+            <w:r>
+              <w:rPr>
+                <w:sz w:val="20"/>
+                <w:szCs w:val="20"/>
+              </w:rPr>
+              <w:lastRenderedPageBreak/>
+              <w:t>obligations of the Issuer under the Purchase Price arising from each  utilisation of the Facility(ies).</w:t>
             </w:r>
           </w:p>
           <w:p>
@@ -2523,7 +2498,16 @@
                 <w:szCs w:val="20"/>
                 <w:lang w:val="en-US"/>
               </w:rPr>
-              <w:t>The Issuer expressly consents that the Drawdown Fee and stamp duty (if any) may be deducted from the Facility proceeds upon disbursement as a payment mechanism only, and such deduction shall not constitute riba, profit capitalisation, or an increase in the outstanding obligation under the Shariah.</w:t>
+              <w:t xml:space="preserve">The Issuer expressly consents that the Drawdown Fee and stamp duty (if any) may be deducted from the Facility proceeds </w:t>
+            </w:r>
+            <w:r>
+              <w:rPr>
+                <w:sz w:val="20"/>
+                <w:szCs w:val="20"/>
+                <w:lang w:val="en-US"/>
+              </w:rPr>
+              <w:lastRenderedPageBreak/>
+              <w:t>upon disbursement as a payment mechanism only, and such deduction shall not constitute riba, profit capitalisation, or an increase in the outstanding obligation under the Shariah.</w:t>
             </w:r>
           </w:p>
           <w:p>
@@ -2593,6 +2577,7 @@
                 <w:sz w:val="20"/>
                 <w:szCs w:val="20"/>
               </w:rPr>
+              <w:lastRenderedPageBreak/>
               <w:t>CONDITION PRECEDENT</w:t>
             </w:r>
           </w:p>
@@ -2728,7 +2713,6 @@
                 <w:sz w:val="20"/>
                 <w:szCs w:val="20"/>
               </w:rPr>
-              <w:lastRenderedPageBreak/>
               <w:t>SSP shall have received the following from the Issuer and/or the Security Party(ies), in form and substance satisfactory to SSP:</w:t>
             </w:r>
           </w:p>
@@ -2893,6 +2877,7 @@
                 <w:sz w:val="20"/>
                 <w:szCs w:val="20"/>
               </w:rPr>
+              <w:lastRenderedPageBreak/>
               <w:t xml:space="preserve">Winding-up, bankruptcy, and/or insolvency searches conducted on the Issuer, its directors, shareholders, corporate/individual guarantors, partners, and/or any third-party depositor(s) (where applicable) shall reveal no adverse findings. </w:t>
             </w:r>
           </w:p>
@@ -3021,7 +3006,6 @@
                 <w:sz w:val="20"/>
                 <w:szCs w:val="20"/>
               </w:rPr>
-              <w:lastRenderedPageBreak/>
               <w:t>Such other documents, information, or evidence as may be required by SSP from time to time at its absolute discretion have been duly provided.</w:t>
             </w:r>
           </w:p>
@@ -3191,14 +3175,7 @@
                 <w:sz w:val="20"/>
                 <w:szCs w:val="20"/>
               </w:rPr>
-              <w:t>Bullet</w:t>
-            </w:r>
-            <w:r>
-              <w:rPr>
-                <w:sz w:val="20"/>
-                <w:szCs w:val="20"/>
-              </w:rPr>
-              <w:t xml:space="preserve"> </w:t>
+              <w:t xml:space="preserve">Bullet </w:t>
             </w:r>
           </w:p>
           <w:p>
@@ -3692,15 +3669,7 @@
                 <w:sz w:val="20"/>
                 <w:szCs w:val="20"/>
               </w:rPr>
-              <w:t xml:space="preserve">Successful financing will be recorded and evidenced via Investment Note(s) prepared by SSP on Issuer’s behalf, </w:t>
-            </w:r>
-            <w:r>
-              <w:rPr>
-                <w:sz w:val="20"/>
-                <w:szCs w:val="20"/>
-              </w:rPr>
-              <w:lastRenderedPageBreak/>
-              <w:t xml:space="preserve">and which will set out the final details and terms and legally binding on the Issuer. </w:t>
+              <w:t xml:space="preserve">Successful financing will be recorded and evidenced via Investment Note(s) prepared by SSP on Issuer’s behalf, and which will set out the final details and terms and legally binding on the Issuer. </w:t>
             </w:r>
           </w:p>
           <w:p>
@@ -3746,7 +3715,15 @@
                 <w:sz w:val="20"/>
                 <w:szCs w:val="20"/>
               </w:rPr>
-              <w:t>The Issuer agrees that any request, confirmation, acceptance, instruction, appointment, undertaking, Investment Note, Sale Contract or other transaction record contemplated under this Letter of Offer and the Facility Agreement may be created, completed, issued, executed and evidenced electronically through the Platform, and shall have the same legal effect as the corresponding document in written form. The Issuer’s acceptance of a Utilisation Offer through the Platform shall constitute the Issuer’s confirmation of the submitted information, acceptance of the offered terms, issuance of the Purchase Requisition and Undertaking to Purchase (Wa’d), and confirmation of the Agent’s authority to carry out and electronically record the required financing, agency and Shariah transaction steps, all in accordance with Clause 3A.4 of the Facility Agreement.</w:t>
+              <w:t xml:space="preserve">The Issuer agrees that any request, confirmation, acceptance, instruction, appointment, undertaking, Investment Note, Sale Contract or other transaction record contemplated under this Letter of Offer and the Facility Agreement may be created, completed, issued, executed and evidenced electronically through the Platform, and shall have the same legal effect as the corresponding document in written form. The Issuer’s </w:t>
+            </w:r>
+            <w:r>
+              <w:rPr>
+                <w:sz w:val="20"/>
+                <w:szCs w:val="20"/>
+              </w:rPr>
+              <w:lastRenderedPageBreak/>
+              <w:t>acceptance of a Utilisation Offer through the Platform shall constitute the Issuer’s confirmation of the submitted information, acceptance of the offered terms, issuance of the Purchase Requisition and Undertaking to Purchase (Wa’d), and confirmation of the Agent’s authority to carry out and electronically record the required financing, agency and Shariah transaction steps, all in accordance with Clause 3A.4 of the Facility Agreement.</w:t>
             </w:r>
           </w:p>
           <w:p>
@@ -3815,15 +3792,7 @@
                 <w:sz w:val="20"/>
                 <w:szCs w:val="20"/>
               </w:rPr>
-              <w:t xml:space="preserve">The Issuer acknowledges and agrees that SSP does not owe any fiduciary or similar duty to the Issuer in </w:t>
-            </w:r>
-            <w:r>
-              <w:rPr>
-                <w:sz w:val="20"/>
-                <w:szCs w:val="20"/>
-              </w:rPr>
-              <w:lastRenderedPageBreak/>
-              <w:t xml:space="preserve">connection with any of the Security Documents or any act or transaction carried out in connection thereto. </w:t>
+              <w:t xml:space="preserve">The Issuer acknowledges and agrees that SSP does not owe any fiduciary or similar duty to the Issuer in connection with any of the Security Documents or any act or transaction carried out in connection thereto. </w:t>
             </w:r>
           </w:p>
           <w:p>
@@ -3973,6 +3942,7 @@
                 <w:sz w:val="20"/>
                 <w:szCs w:val="20"/>
               </w:rPr>
+              <w:lastRenderedPageBreak/>
               <w:t xml:space="preserve">not result in an increase in the principal amount outstanding; </w:t>
             </w:r>
           </w:p>
@@ -4244,7 +4214,6 @@
                 <w:sz w:val="20"/>
                 <w:szCs w:val="20"/>
               </w:rPr>
-              <w:lastRenderedPageBreak/>
               <w:t>The Issuer agrees and hereby permits that, for as long as the Facility continues and/or any indebtedness remains outstanding, SSP shall be entitled to disclose all or any part of any information relating to the Issuer’s business (including its current or future accounts, reports, or documents supplied in connection with this Facility) to any of the following parties:</w:t>
             </w:r>
           </w:p>
@@ -4278,7 +4247,15 @@
                 <w:sz w:val="20"/>
                 <w:szCs w:val="20"/>
               </w:rPr>
-              <w:t>to any current or future corporation which may be associated with or related to the P2P Operator (as defined under Section 7 of the Companies Act 2016), including their head offices, representative offices, branch offices, subsidiaries, affiliates, and respective representatives;</w:t>
+              <w:t xml:space="preserve">to any current or future corporation which may be associated with or related to the P2P Operator (as defined under Section 7 of the Companies Act 2016), including </w:t>
+            </w:r>
+            <w:r>
+              <w:rPr>
+                <w:sz w:val="20"/>
+                <w:szCs w:val="20"/>
+              </w:rPr>
+              <w:lastRenderedPageBreak/>
+              <w:t>their head offices, representative offices, branch offices, subsidiaries, affiliates, and respective representatives;</w:t>
             </w:r>
           </w:p>
           <w:p>
@@ -4472,7 +4449,6 @@
                 <w:sz w:val="20"/>
                 <w:szCs w:val="20"/>
               </w:rPr>
-              <w:lastRenderedPageBreak/>
               <w:t>pursuant to any court order, arbitration award, or other legal process, or in connection with any legal action, suit, or proceeding relating to this Letter of Offer or any other transaction documents;</w:t>
             </w:r>
           </w:p>
@@ -4541,6 +4517,7 @@
                 <w:sz w:val="20"/>
                 <w:szCs w:val="20"/>
               </w:rPr>
+              <w:lastRenderedPageBreak/>
               <w:t>to any authorised person upon the occurrence of an Event of Default;</w:t>
             </w:r>
           </w:p>
@@ -4995,8 +4972,15 @@
           <w:sz w:val="20"/>
           <w:szCs w:val="20"/>
         </w:rPr>
+        <w:t xml:space="preserve">This offer is made subject to SSP’s absolute discretion to withdraw, vary, suspend or terminate the offer, whether prior to, on or after the acceptance of this Letter of Offer, if SSP deems it </w:t>
+      </w:r>
+      <w:r>
+        <w:rPr>
+          <w:sz w:val="20"/>
+          <w:szCs w:val="20"/>
+        </w:rPr>
         <w:lastRenderedPageBreak/>
-        <w:t>This offer is made subject to SSP’s absolute discretion to withdraw, vary, suspend or terminate the offer, whether prior to, on or after the acceptance of this Letter of Offer, if SSP deems it necessary to do so in order to safeguard its interests (including in view of any circumstances, financial or otherwise, relating to the Issuer of which SSP has knowledge).</w:t>
+        <w:t>necessary to do so in order to safeguard its interests (including in view of any circumstances, financial or otherwise, relating to the Issuer of which SSP has knowledge).</w:t>
       </w:r>
     </w:p>
     <w:p>
@@ -5031,21 +5015,7 @@
           <w:sz w:val="20"/>
           <w:szCs w:val="20"/>
         </w:rPr>
-        <w:t xml:space="preserve">In such an event, SSP shall provide the Issuer with not less than </w:t>
-      </w:r>
-      <w:r>
-        <w:rPr>
-          <w:sz w:val="20"/>
-          <w:szCs w:val="20"/>
-        </w:rPr>
-        <w:t>twenty-one (21) days’</w:t>
-      </w:r>
-      <w:r>
-        <w:rPr>
-          <w:sz w:val="20"/>
-          <w:szCs w:val="20"/>
-        </w:rPr>
-        <w:t xml:space="preserve"> prior written notice, which may include notification via electronic means.</w:t>
+        <w:t>In such an event, SSP shall provide the Issuer with not less than twenty-one (21) days’ prior written notice, which may include notification via electronic means.</w:t>
       </w:r>
     </w:p>
     <w:p>
@@ -5412,14 +5382,35 @@
     </w:p>
     <w:p>
       <w:pPr>
-        <w:spacing w:line="360" w:lineRule="auto"/>
+        <w:rPr>
+          <w:sz w:val="20"/>
+          <w:szCs w:val="20"/>
+        </w:rPr>
+      </w:pPr>
+      <w:r>
+        <w:rPr>
+          <w:sz w:val="20"/>
+          <w:szCs w:val="20"/>
+        </w:rPr>
+        <w:br w:type="page"/>
+      </w:r>
+    </w:p>
+    <w:p>
+      <w:pPr>
+        <w:spacing w:line="360" w:lineRule="auto"/>
+        <w:jc w:val="center"/>
+      </w:pPr>
+      <w:r>
         <w:rPr>
           <w:b/>
           <w:bCs/>
           <w:sz w:val="20"/>
           <w:szCs w:val="20"/>
-        </w:rPr>
-      </w:pPr>
+          <w:u w:val="single"/>
+        </w:rPr>
+        <w:lastRenderedPageBreak/>
+        <w:t>SCHEDULE A</w:t>
+      </w:r>
     </w:p>
     <w:p>
       <w:pPr>
@@ -5432,58 +5423,41 @@
           <w:bCs/>
           <w:sz w:val="20"/>
           <w:szCs w:val="20"/>
-          <w:u w:val="single"/>
-        </w:rPr>
-        <w:lastRenderedPageBreak/>
-        <w:t>SCHEDULE A</w:t>
-      </w:r>
-    </w:p>
-    <w:p>
-      <w:pPr>
-        <w:spacing w:line="360" w:lineRule="auto"/>
-        <w:jc w:val="center"/>
-      </w:pPr>
-      <w:r>
+        </w:rPr>
+        <w:t>SPECIFIC TERMS AND CONDITIONS FOR THE FACILITY</w:t>
+      </w:r>
+    </w:p>
+    <w:p>
+      <w:pPr>
+        <w:spacing w:line="360" w:lineRule="auto"/>
+        <w:jc w:val="both"/>
+      </w:pPr>
+      <w:r>
+        <w:rPr>
+          <w:sz w:val="20"/>
+          <w:szCs w:val="20"/>
+        </w:rPr>
+        <w:t>This Facility is offered under one of two structures. Only the Part corresponding to the Facility Type stated in the Basic Terms above shall apply; the other Part shall be disregarded.</w:t>
+      </w:r>
+    </w:p>
+    <w:p>
+      <w:pPr>
+        <w:spacing w:line="360" w:lineRule="auto"/>
+        <w:jc w:val="both"/>
         <w:rPr>
           <w:b/>
           <w:bCs/>
           <w:sz w:val="20"/>
           <w:szCs w:val="20"/>
         </w:rPr>
-        <w:t>SPECIFIC TERMS AND CONDITIONS FOR THE FACILITY</w:t>
-      </w:r>
-    </w:p>
-    <w:p>
-      <w:pPr>
-        <w:spacing w:line="360" w:lineRule="auto"/>
-        <w:jc w:val="both"/>
-      </w:pPr>
-      <w:r>
-        <w:rPr>
-          <w:sz w:val="20"/>
-          <w:szCs w:val="20"/>
-        </w:rPr>
-        <w:t>This Facility is offered under one of two structures. Only the Part corresponding to the Facility Type stated in the Basic Terms above shall apply; the other Part shall be disregarded.</w:t>
-      </w:r>
-    </w:p>
-    <w:p>
-      <w:pPr>
-        <w:spacing w:line="360" w:lineRule="auto"/>
-        <w:jc w:val="both"/>
+      </w:pPr>
+      <w:r>
         <w:rPr>
           <w:b/>
           <w:bCs/>
           <w:sz w:val="20"/>
           <w:szCs w:val="20"/>
         </w:rPr>
-      </w:pPr>
-      <w:r>
-        <w:rPr>
-          <w:b/>
-          <w:bCs/>
-          <w:sz w:val="20"/>
-          <w:szCs w:val="20"/>
-        </w:rPr>
         <w:t xml:space="preserve">Facility Type (tick one):   </w:t>
       </w:r>
     </w:p>
@@ -5496,6 +5470,15 @@
           <w:szCs w:val="20"/>
         </w:rPr>
       </w:pPr>
+      <w:r>
+        <w:rPr>
+          <w:rFonts w:ascii="Segoe UI Symbol" w:hAnsi="Segoe UI Symbol" w:cs="Segoe UI Symbol"/>
+          <w:sz w:val="20"/>
+          <w:szCs w:val="20"/>
+          <w:highlight w:val="yellow"/>
+        </w:rPr>
+        <w:t>{part_a_</w:t>
+      </w:r>
       <w:proofErr w:type="gramStart"/>
       <w:r>
         <w:rPr>
@@ -5504,7 +5487,7 @@
           <w:szCs w:val="20"/>
           <w:highlight w:val="yellow"/>
         </w:rPr>
-        <w:t>{part_a_checkbox}</w:t>
+        <w:t>checkbox}</w:t>
       </w:r>
       <w:r>
         <w:rPr>
@@ -5527,6 +5510,15 @@
         <w:spacing w:line="360" w:lineRule="auto"/>
         <w:jc w:val="both"/>
       </w:pPr>
+      <w:r>
+        <w:rPr>
+          <w:rFonts w:ascii="Segoe UI Symbol" w:hAnsi="Segoe UI Symbol" w:cs="Segoe UI Symbol"/>
+          <w:sz w:val="20"/>
+          <w:szCs w:val="20"/>
+          <w:highlight w:val="yellow"/>
+        </w:rPr>
+        <w:t>{part_b_</w:t>
+      </w:r>
       <w:proofErr w:type="gramStart"/>
       <w:r>
         <w:rPr>
@@ -5535,7 +5527,7 @@
           <w:szCs w:val="20"/>
           <w:highlight w:val="yellow"/>
         </w:rPr>
-        <w:t>{part_b_checkbox}</w:t>
+        <w:t>checkbox}</w:t>
       </w:r>
       <w:r>
         <w:rPr>
@@ -6480,6 +6472,7 @@
                 <w:sz w:val="20"/>
                 <w:szCs w:val="20"/>
               </w:rPr>
+              <w:lastRenderedPageBreak/>
               <w:t xml:space="preserve">All fees constitute </w:t>
             </w:r>
             <w:proofErr w:type="spellStart"/>
@@ -6504,7 +6497,7 @@
           <w:p>
             <w:pPr>
               <w:spacing w:line="360" w:lineRule="auto"/>
-              <w:jc w:val="both"/>
+              <w:jc w:val="right"/>
               <w:rPr>
                 <w:sz w:val="20"/>
                 <w:szCs w:val="20"/>
@@ -6516,25 +6509,8 @@
     </w:tbl>
     <w:p>
       <w:pPr>
-        <w:rPr>
-          <w:sz w:val="20"/>
-          <w:szCs w:val="20"/>
-        </w:rPr>
-      </w:pPr>
-      <w:r>
-        <w:rPr>
-          <w:sz w:val="20"/>
-          <w:szCs w:val="20"/>
-        </w:rPr>
-        <w:br w:type="page"/>
-      </w:r>
-    </w:p>
-    <w:p>
-      <w:pPr>
-        <w:spacing w:line="360" w:lineRule="auto"/>
-        <w:jc w:val="both"/>
-      </w:pPr>
-      <w:r>
+        <w:spacing w:line="360" w:lineRule="auto"/>
+        <w:jc w:val="both"/>
         <w:rPr>
           <w:b/>
           <w:bCs/>
@@ -6542,7 +6518,21 @@
           <w:szCs w:val="20"/>
           <w:u w:val="single"/>
         </w:rPr>
-        <w:lastRenderedPageBreak/>
+      </w:pPr>
+    </w:p>
+    <w:p>
+      <w:pPr>
+        <w:spacing w:line="360" w:lineRule="auto"/>
+        <w:jc w:val="both"/>
+      </w:pPr>
+      <w:r>
+        <w:rPr>
+          <w:b/>
+          <w:bCs/>
+          <w:sz w:val="20"/>
+          <w:szCs w:val="20"/>
+          <w:u w:val="single"/>
+        </w:rPr>
         <w:t>PART B — INVOICE-BASED FINANCING (SINGLE INVOICE)</w:t>
       </w:r>
     </w:p>
@@ -6934,6 +6924,7 @@
                 <w:sz w:val="20"/>
                 <w:szCs w:val="20"/>
               </w:rPr>
+              <w:lastRenderedPageBreak/>
               <w:t>Drawdowns</w:t>
             </w:r>
           </w:p>
@@ -7116,7 +7107,6 @@
                 <w:sz w:val="20"/>
                 <w:szCs w:val="20"/>
               </w:rPr>
-              <w:lastRenderedPageBreak/>
               <w:t>Facility Fee</w:t>
             </w:r>
           </w:p>
@@ -7476,6 +7466,7 @@
                 <w:sz w:val="20"/>
                 <w:szCs w:val="20"/>
               </w:rPr>
+              <w:lastRenderedPageBreak/>
               <w:t>Eligible Receivables</w:t>
             </w:r>
           </w:p>
@@ -7504,6 +7495,7 @@
                 <w:sz w:val="20"/>
                 <w:szCs w:val="20"/>
               </w:rPr>
+              <w:lastRenderedPageBreak/>
               <w:t xml:space="preserve">Only receivables which satisfy </w:t>
             </w:r>
             <w:proofErr w:type="gramStart"/>
@@ -7605,7 +7597,6 @@
                 <w:sz w:val="20"/>
                 <w:szCs w:val="20"/>
               </w:rPr>
-              <w:lastRenderedPageBreak/>
               <w:t>the receivable and the underlying contract (where applicable) are acceptable to the Platform, acting in its sole and absolute discretion.</w:t>
             </w:r>
           </w:p>
@@ -7963,21 +7954,7 @@
           <w:sz w:val="20"/>
           <w:szCs w:val="20"/>
         </w:rPr>
-        <w:t xml:space="preserve">such other letters of award, contracts, invoices, purchase orders or such other agreements between the Issuer and Approved </w:t>
-      </w:r>
-      <w:r>
-        <w:rPr>
-          <w:sz w:val="20"/>
-          <w:szCs w:val="20"/>
-        </w:rPr>
-        <w:t>Buyer(s)</w:t>
-      </w:r>
-      <w:r>
-        <w:rPr>
-          <w:sz w:val="20"/>
-          <w:szCs w:val="20"/>
-        </w:rPr>
-        <w:t xml:space="preserve"> which is acceptable to SSP, acting in its sole and absolute discretion,</w:t>
+        <w:t>such other letters of award, contracts, invoices, purchase orders or such other agreements between the Issuer and Approved Buyer(s) which is acceptable to SSP, acting in its sole and absolute discretion,</w:t>
       </w:r>
     </w:p>
     <w:p>
@@ -8081,8 +8058,8 @@
           <w:bCs/>
           <w:sz w:val="20"/>
           <w:szCs w:val="20"/>
+          <w:highlight w:val="yellow"/>
           <w:u w:val="single"/>
-          <w:highlight w:val="yellow"/>
         </w:rPr>
         <w:t>{letter_date}</w:t>
       </w:r>
@@ -8395,6 +8372,7 @@
           <w:sz w:val="20"/>
           <w:szCs w:val="20"/>
         </w:rPr>
+        <w:lastRenderedPageBreak/>
         <w:t>{#has_individual_guarantors}</w:t>
       </w:r>
     </w:p>
@@ -8534,7 +8512,14 @@
           <w:sz w:val="20"/>
           <w:szCs w:val="20"/>
         </w:rPr>
-        <w:t>For the avoidance of doubt, the obligations and liabilities of the Guarantors under this Letter of Offer shall be further set out in a Guarantee Agreement to be executed by the Guarantors in favour of Shoraka Suyula Platform Sdn. Bhd. (Reg. No : 202101033028 (1433328-H)). The Guarantors expressly acknowledge and agree that the execution of such Guarantee Agreement shall constitute a condition precedent to the disbursement of the Facility and that the detailed terms, covenants and undertakings therein shall prevail and be binding upon the Guarantors in addition to the provisions of this Letter of Offer.</w:t>
+        <w:t xml:space="preserve">For the avoidance of doubt, the obligations and liabilities of the Guarantors under this Letter of Offer shall be further set out in a Guarantee Agreement to be executed by the Guarantors in favour of Shoraka Suyula Platform Sdn. Bhd. (Reg. No : 202101033028 (1433328-H)). The Guarantors expressly acknowledge and agree that the execution of such Guarantee Agreement shall constitute a condition precedent to the disbursement of the Facility and that the detailed terms, covenants and undertakings therein shall </w:t>
+      </w:r>
+      <w:r>
+        <w:rPr>
+          <w:sz w:val="20"/>
+          <w:szCs w:val="20"/>
+        </w:rPr>
+        <w:t>prevail and be binding upon the Guarantors in addition to the provisions of this Letter of Offer.</w:t>
       </w:r>
     </w:p>
     <w:p>
@@ -8623,15 +8608,7 @@
           <w:sz w:val="20"/>
           <w:szCs w:val="20"/>
         </w:rPr>
-        <w:t xml:space="preserve">NRIC : </w:t>
-      </w:r>
-      <w:r>
-        <w:rPr>
-          <w:sz w:val="20"/>
-          <w:szCs w:val="20"/>
-          <w:highlight w:val="yellow"/>
-        </w:rPr>
-        <w:t>{nric}</w:t>
+        <w:t>NRIC :</w:t>
       </w:r>
     </w:p>
     <w:p>
@@ -8750,6 +8727,7 @@
           <w:sz w:val="20"/>
           <w:szCs w:val="20"/>
         </w:rPr>
+        <w:lastRenderedPageBreak/>
         <w:t>{#is_first_page}</w:t>
       </w:r>
     </w:p>
@@ -8867,7 +8845,14 @@
           <w:sz w:val="20"/>
           <w:szCs w:val="20"/>
         </w:rPr>
-        <w:t>For the avoidance of doubt, the obligations and liabilities of the Guarantors under this Letter of Offer shall be further set out in a Guarantee Agreement to be executed by the Guarantors in favour of Shoraka Suyula Platform Sdn. Bhd. (Reg. No : 202101033028 (1433328-H)). The Guarantors expressly acknowledge and agree that the execution of such Guarantee Agreement shall constitute a condition precedent to the disbursement of the Facility and that the detailed terms, covenants and undertakings therein shall prevail and be binding upon the Guarantors in addition to the provisions of this Letter of Offer.</w:t>
+        <w:t xml:space="preserve">For the avoidance of doubt, the obligations and liabilities of the Guarantors under this Letter of Offer shall be further set out in a Guarantee Agreement to be executed by the Guarantors in favour of Shoraka Suyula Platform Sdn. Bhd. (Reg. No : 202101033028 (1433328-H)). The Guarantors expressly acknowledge and agree that the execution of such Guarantee Agreement shall constitute a condition precedent to the disbursement of the Facility and that the detailed terms, covenants and undertakings therein shall </w:t>
+      </w:r>
+      <w:r>
+        <w:rPr>
+          <w:sz w:val="20"/>
+          <w:szCs w:val="20"/>
+        </w:rPr>
+        <w:t>prevail and be binding upon the Guarantors in addition to the provisions of this Letter of Offer.</w:t>
       </w:r>
     </w:p>
     <w:p>
@@ -8956,6 +8941,46 @@
         </w:rPr>
         <w:t>{company_ssm}</w:t>
       </w:r>
+    </w:p>
+    <w:p>
+      <w:pPr>
+        <w:spacing w:line="360" w:lineRule="auto"/>
+        <w:jc w:val="both"/>
+        <w:rPr>
+          <w:sz w:val="20"/>
+          <w:szCs w:val="20"/>
+        </w:rPr>
+      </w:pPr>
+    </w:p>
+    <w:p>
+      <w:pPr>
+        <w:spacing w:line="360" w:lineRule="auto"/>
+        <w:jc w:val="both"/>
+        <w:rPr>
+          <w:sz w:val="20"/>
+          <w:szCs w:val="20"/>
+        </w:rPr>
+      </w:pPr>
+    </w:p>
+    <w:p>
+      <w:pPr>
+        <w:spacing w:line="360" w:lineRule="auto"/>
+        <w:jc w:val="both"/>
+        <w:rPr>
+          <w:sz w:val="20"/>
+          <w:szCs w:val="20"/>
+        </w:rPr>
+      </w:pPr>
+    </w:p>
+    <w:p>
+      <w:pPr>
+        <w:spacing w:line="360" w:lineRule="auto"/>
+        <w:jc w:val="both"/>
+        <w:rPr>
+          <w:sz w:val="20"/>
+          <w:szCs w:val="20"/>
+        </w:rPr>
+      </w:pPr>
     </w:p>
     <w:tbl>
       <w:tblPr>
@@ -8964,13 +8989,10 @@
         <w:tblLook w:val="04A0" w:firstRow="1" w:lastRow="0" w:firstColumn="1" w:lastColumn="0" w:noHBand="0" w:noVBand="1"/>
       </w:tblPr>
       <w:tblGrid>
-        <w:gridCol w:w="4513"/>
-        <w:gridCol w:w="4513"/>
+        <w:gridCol w:w="4684"/>
+        <w:gridCol w:w="4342"/>
       </w:tblGrid>
       <w:tr>
-        <w:trPr>
-          <w:cantSplit/>
-        </w:trPr>
         <w:tc>
           <w:tcPr>
             <w:tcW w:w="4675" w:type="dxa"/>
@@ -9025,7 +9047,23 @@
                 <w:sz w:val="20"/>
                 <w:szCs w:val="20"/>
               </w:rPr>
-              <w:t>{#signatory_rows}______________________________</w:t>
+              <w:t>{#signatory_</w:t>
+            </w:r>
+            <w:proofErr w:type="gramStart"/>
+            <w:r>
+              <w:rPr>
+                <w:sz w:val="20"/>
+                <w:szCs w:val="20"/>
+              </w:rPr>
+              <w:t>rows}_</w:t>
+            </w:r>
+            <w:proofErr w:type="gramEnd"/>
+            <w:r>
+              <w:rPr>
+                <w:sz w:val="20"/>
+                <w:szCs w:val="20"/>
+              </w:rPr>
+              <w:t>_____________________________</w:t>
             </w:r>
           </w:p>
           <w:p>
@@ -9060,15 +9098,7 @@
                 <w:sz w:val="20"/>
                 <w:szCs w:val="20"/>
               </w:rPr>
-              <w:t xml:space="preserve">NRIC : </w:t>
-            </w:r>
-            <w:r>
-              <w:rPr>
-                <w:sz w:val="20"/>
-                <w:szCs w:val="20"/>
-                <w:highlight w:val="yellow"/>
-              </w:rPr>
-              <w:t>{left_nric}</w:t>
+              <w:t>NRIC :</w:t>
             </w:r>
           </w:p>
           <w:p>
@@ -9143,7 +9173,23 @@
                 <w:sz w:val="20"/>
                 <w:szCs w:val="20"/>
               </w:rPr>
-              <w:t>{#show_right}______________________________</w:t>
+              <w:t>{#show_</w:t>
+            </w:r>
+            <w:proofErr w:type="gramStart"/>
+            <w:r>
+              <w:rPr>
+                <w:sz w:val="20"/>
+                <w:szCs w:val="20"/>
+              </w:rPr>
+              <w:t>right}_</w:t>
+            </w:r>
+            <w:proofErr w:type="gramEnd"/>
+            <w:r>
+              <w:rPr>
+                <w:sz w:val="20"/>
+                <w:szCs w:val="20"/>
+              </w:rPr>
+              <w:t>_____________________________</w:t>
             </w:r>
           </w:p>
           <w:p>
@@ -9178,15 +9224,7 @@
                 <w:sz w:val="20"/>
                 <w:szCs w:val="20"/>
               </w:rPr>
-              <w:t xml:space="preserve">NRIC : </w:t>
-            </w:r>
-            <w:r>
-              <w:rPr>
-                <w:sz w:val="20"/>
-                <w:szCs w:val="20"/>
-                <w:highlight w:val="yellow"/>
-              </w:rPr>
-              <w:t>{right_nric}</w:t>
+              <w:t>NRIC :</w:t>
             </w:r>
           </w:p>
           <w:p>
@@ -9240,6 +9278,7 @@
           <w:sz w:val="20"/>
           <w:szCs w:val="20"/>
         </w:rPr>
+        <w:lastRenderedPageBreak/>
         <w:t>{/corporate_guarantor_pages}</w:t>
       </w:r>
     </w:p>
@@ -9526,6 +9565,13 @@
         </w:rPr>
         <w:t>Since the date of your application for the facility(ies), there has been no material adverse change in your financial condition or operations.</w:t>
       </w:r>
+      <w:r>
+        <w:rPr>
+          <w:sz w:val="20"/>
+          <w:szCs w:val="20"/>
+        </w:rPr>
+        <w:t xml:space="preserve"> </w:t>
+      </w:r>
     </w:p>
     <w:p>
       <w:pPr>
@@ -9547,15 +9593,8 @@
           <w:sz w:val="20"/>
           <w:szCs w:val="20"/>
         </w:rPr>
-        <w:t xml:space="preserve">All information provided by you in connection with the facility(ies) is complete, accurate, and does not omit any material facts that would make any statements made by you misleading. </w:t>
-      </w:r>
-      <w:r>
-        <w:rPr>
-          <w:sz w:val="20"/>
-          <w:szCs w:val="20"/>
-        </w:rPr>
         <w:lastRenderedPageBreak/>
-        <w:t>Furthermore, all representations of expectation, intention, belief, and opinion made by you have been made in good faith, on reasonable grounds, and following due and proper inquiry.</w:t>
+        <w:t>All information provided by you in connection with the facility(ies) is complete, accurate, and does not omit any material facts that would make any statements made by you misleading. Furthermore, all representations of expectation, intention, belief, and opinion made by you have been made in good faith, on reasonable grounds, and following due and proper inquiry.</w:t>
       </w:r>
     </w:p>
     <w:p>
@@ -9824,14 +9863,29 @@
           <w:sz w:val="20"/>
           <w:szCs w:val="20"/>
         </w:rPr>
-        <w:t>Active Account Management: Operate your account in a fully active and satisfactory manner, ensuring that the approved Financing Limit (for a Part A Contract-Based Facility) and the terms of each Investment Note are observed at all times.</w:t>
-      </w:r>
-    </w:p>
-    <w:p>
-      <w:pPr>
-        <w:pStyle w:val="NoSpacing"/>
-        <w:spacing w:line="360" w:lineRule="auto"/>
-        <w:ind w:left="851"/>
+        <w:t xml:space="preserve">Active Account Management: Operate your account in a fully active and satisfactory manner, ensuring that the approved Financing Limit (for a Part A Contract-Based Facility) and the terms of each Investment Note are </w:t>
+      </w:r>
+      <w:proofErr w:type="gramStart"/>
+      <w:r>
+        <w:rPr>
+          <w:sz w:val="20"/>
+          <w:szCs w:val="20"/>
+        </w:rPr>
+        <w:t>observed at all times</w:t>
+      </w:r>
+      <w:proofErr w:type="gramEnd"/>
+      <w:r>
+        <w:rPr>
+          <w:sz w:val="20"/>
+          <w:szCs w:val="20"/>
+        </w:rPr>
+        <w:t>.</w:t>
+      </w:r>
+    </w:p>
+    <w:p>
+      <w:pPr>
+        <w:pStyle w:val="NoSpacing"/>
+        <w:spacing w:line="360" w:lineRule="auto"/>
         <w:jc w:val="both"/>
         <w:rPr>
           <w:b/>
@@ -9902,7 +9956,6 @@
           <w:sz w:val="20"/>
           <w:szCs w:val="20"/>
         </w:rPr>
-        <w:lastRenderedPageBreak/>
         <w:t>Provide SSP with your audited financial statements for each of your financial periods, which shall contain an income statement and balance sheet, audited and certified by an independent firm of accountants, within six (6) months after the end of each period.</w:t>
       </w:r>
     </w:p>
@@ -10149,6 +10202,7 @@
           <w:sz w:val="20"/>
           <w:szCs w:val="20"/>
         </w:rPr>
+        <w:lastRenderedPageBreak/>
         <w:t>Notification of Adverse Events: Immediately notify SSP of any event described in Paragraph C hereof, or any material adverse change in your financial condition, or any other event that may reasonably affect your ability to perform your obligations under this Letter of Offer or any related legal and/or security documents.</w:t>
       </w:r>
     </w:p>
@@ -10184,7 +10238,6 @@
           <w:sz w:val="20"/>
           <w:szCs w:val="20"/>
         </w:rPr>
-        <w:lastRenderedPageBreak/>
         <w:t>Notification of Changes in Signatories: Notify SSP if any of your authorized signatories are no longer authorized to sign or act on your behalf under this Letter of Offer.</w:t>
       </w:r>
     </w:p>
@@ -10511,6 +10564,7 @@
           <w:sz w:val="20"/>
           <w:szCs w:val="20"/>
         </w:rPr>
+        <w:lastRenderedPageBreak/>
         <w:t>By accepting this Letter of Offer, you further covenant and agree that for so long as any sum remains outstanding or payable hereunder, you shall not, without SSP’s prior written consent:</w:t>
       </w:r>
     </w:p>
@@ -10580,7 +10634,6 @@
           <w:sz w:val="20"/>
           <w:szCs w:val="20"/>
         </w:rPr>
-        <w:lastRenderedPageBreak/>
         <w:t>Creation of Liens: Create or permit any lien or encumbrance on any of your assets, except for tax or statutory liens that are discharged within thirty (30) days of final adjudication, security granted in the ordinary course of business in connection with other financing and any security which does not materially prejudice the interests of the investors. "Lien" includes any assignment, mortgage, pledge, charge, privilege, encumbrance, or priority, and "assets" include any rights, receivables, or property, whether movable or immovable, present or future.</w:t>
       </w:r>
       <w:r>
@@ -10813,6 +10866,7 @@
           <w:sz w:val="20"/>
           <w:szCs w:val="20"/>
         </w:rPr>
+        <w:lastRenderedPageBreak/>
         <w:t>Additional Fundraising through any other P2P Platform: Shall not raise or obtain any financing, nor sell, assign, factor, discount or otherwise encumber any of the Receivables, through any other peer-to-peer financing platform, equity crowdfunding platform, similar digital fundraising platform, factoring house, financial institution, bank or any other person or financing arrangement, whether digital or otherwise, during the Tenure of this Facility.</w:t>
       </w:r>
     </w:p>
@@ -10882,15 +10936,7 @@
           <w:sz w:val="20"/>
           <w:szCs w:val="20"/>
         </w:rPr>
-        <w:t xml:space="preserve">Notwithstanding any provisions herein regarding repayment of the facility(ies), SSP reserves the right to cancel the facility(ies), or any part thereof, whereupon all principal, advances, late payment charges, </w:t>
-      </w:r>
-      <w:r>
-        <w:rPr>
-          <w:sz w:val="20"/>
-          <w:szCs w:val="20"/>
-        </w:rPr>
-        <w:lastRenderedPageBreak/>
-        <w:t>and all other sums owed to SSP and/or Investors, secured by any security, shall be immediately repayable upon demand. SSP may also withdraw any sums payable by you to SSP and/or Investors from your account under the following circumstances:</w:t>
+        <w:t>Notwithstanding any provisions herein regarding repayment of the facility(ies), SSP reserves the right to cancel the facility(ies), or any part thereof, whereupon all principal, advances, late payment charges, and all other sums owed to SSP and/or Investors, secured by any security, shall be immediately repayable upon demand. SSP may also withdraw any sums payable by you to SSP and/or Investors from your account under the following circumstances:</w:t>
       </w:r>
     </w:p>
     <w:p>
@@ -11091,6 +11137,7 @@
           <w:sz w:val="20"/>
           <w:szCs w:val="20"/>
         </w:rPr>
+        <w:lastRenderedPageBreak/>
         <w:t>Inability to Pay Debts: You, your guarantor, or any security party is unable to pay any debts as they become due, suspends payments, or proposes to enter into any arrangement or composition (whether voluntary or otherwise) with creditors, or commits an act of bankruptcy, enters insolvency proceedings, or a resolution is passed, or an application is made for you, your guarantor, or security party to be placed under judicial management.</w:t>
       </w:r>
     </w:p>
@@ -11189,7 +11236,6 @@
           <w:sz w:val="20"/>
           <w:szCs w:val="20"/>
         </w:rPr>
-        <w:lastRenderedPageBreak/>
         <w:t>Bad Cheque Listing: You are listed as a bad cheque offender by the Dishonoured Cheques Information System maintained by Bank Negara Malaysia (“BNM”).</w:t>
       </w:r>
     </w:p>
@@ -11382,7 +11428,15 @@
           <w:sz w:val="20"/>
           <w:szCs w:val="20"/>
         </w:rPr>
-        <w:t>Indebtedness Due Before Maturity: Any of your indebtedness, or that of your guarantor or any security party, becomes due or capable of being declared due before its stated maturity, any guarantee given by you, your guarantor, or any security party is not discharged when due, or you, your guarantor, or any security party defaults or breaches any instrument or agreement relating to any such indebtedness or guarantee.</w:t>
+        <w:t xml:space="preserve">Indebtedness Due Before Maturity: Any of your indebtedness, or that of your guarantor or any security party, becomes due or capable of being declared due before its stated maturity, any guarantee given by you, your guarantor, or any security party is not discharged when due, or </w:t>
+      </w:r>
+      <w:r>
+        <w:rPr>
+          <w:sz w:val="20"/>
+          <w:szCs w:val="20"/>
+        </w:rPr>
+        <w:lastRenderedPageBreak/>
+        <w:t>you, your guarantor, or any security party defaults or breaches any instrument or agreement relating to any such indebtedness or guarantee.</w:t>
       </w:r>
     </w:p>
     <w:p>
@@ -11478,7 +11532,6 @@
           <w:sz w:val="20"/>
           <w:szCs w:val="20"/>
         </w:rPr>
-        <w:lastRenderedPageBreak/>
         <w:t>Appointment of Insolvency Professional: A manager, trustee, nominee, supervisor, judicial manager, custodian, liquidator (provisional or otherwise), receiver, or similar person is appointed in respect of all or part of your business or assets or that of your guarantor or any Security Party.</w:t>
       </w:r>
     </w:p>
@@ -11822,7 +11875,6 @@
           <w:szCs w:val="20"/>
           <w:lang w:val="en-US"/>
         </w:rPr>
-        <w:lastRenderedPageBreak/>
         <w:t>RECOVERY COSTS</w:t>
       </w:r>
     </w:p>
@@ -12227,7 +12279,6 @@
           <w:szCs w:val="20"/>
           <w:lang w:val="en-US"/>
         </w:rPr>
-        <w:lastRenderedPageBreak/>
         <w:t>Notwithstanding the Late Payment Charges (Ta’widh) charged, it is expressly acknowledged and agreed that the amount of Late Payment Charges (Ta’widh) shall not be further compounded.</w:t>
       </w:r>
     </w:p>
@@ -12448,6 +12499,7 @@
           <w:szCs w:val="20"/>
           <w:lang w:val="en-US"/>
         </w:rPr>
+        <w:lastRenderedPageBreak/>
         <w:t>The Hibah granted by the Agent will not constitute a contractual obligation but shall be at SSP’s discretion, in compliance with Shariah principles governing Baiʿ Dayn bi al-Silaʿ.</w:t>
       </w:r>
     </w:p>
@@ -12692,16 +12744,7 @@
           <w:szCs w:val="20"/>
           <w:lang w:val="en-US"/>
         </w:rPr>
-        <w:t xml:space="preserve">This Letter of Offer shall be governed by and construed in accordance with the applicable laws of Malaysia in all matters relating to the obligations and liabilities of the parties under this Letter </w:t>
-      </w:r>
-      <w:r>
-        <w:rPr>
-          <w:sz w:val="20"/>
-          <w:szCs w:val="20"/>
-          <w:lang w:val="en-US"/>
-        </w:rPr>
-        <w:lastRenderedPageBreak/>
-        <w:t>of Offer. The parties hereby submit to the exclusive jurisdiction of the courts of Malaysia; however, such submission shall not limit the right of SSP to initiate proceedings in any other jurisdiction. SSP may, at its discretion, initiate actions, proceedings, or otherwise take legal action against the Issuer in Malaysia and/or elsewhere, or concurrently in multiple jurisdictions, as SSP deems appropriate.</w:t>
+        <w:t>This Letter of Offer shall be governed by and construed in accordance with the applicable laws of Malaysia in all matters relating to the obligations and liabilities of the parties under this Letter of Offer. The parties hereby submit to the exclusive jurisdiction of the courts of Malaysia; however, such submission shall not limit the right of SSP to initiate proceedings in any other jurisdiction. SSP may, at its discretion, initiate actions, proceedings, or otherwise take legal action against the Issuer in Malaysia and/or elsewhere, or concurrently in multiple jurisdictions, as SSP deems appropriate.</w:t>
       </w:r>
     </w:p>
     <w:p>
@@ -12815,7 +12858,16 @@
           <w:szCs w:val="20"/>
           <w:lang w:val="en-US"/>
         </w:rPr>
-        <w:t>You hereby consent to SSP disclosing information and/or financial data, including but not limited to data relating to or documents supplied in connection with the facility(ies), your business, and your account(s) with SSP  (including any future accounts), to SSP’s subsidiaries, any company that is or may in the future become a related company to SSP, any Investor or the Investor’s head offices, representative and branch offices, and/or any related or associated company of the Investors in any jurisdiction, agents, auditors, legal counsels, insurers, professional advisors, or representatives, the Central Credit Unit, or any other banking or regulatory authorities. This disclosure may also include any co-debtor, joint account holder, guarantor, charger, surety, security party, any party making a claim under a third-party payment instrument or trade document, or any other person who has undertaken liability for the facility(ies) with SSP or under any law or legal process, or in connection with any action, suit, or proceeding relating to the facility(ies).</w:t>
+        <w:t xml:space="preserve">You hereby consent to SSP disclosing information and/or financial data, including but not limited to data relating to or documents supplied in connection with the facility(ies), your business, and </w:t>
+      </w:r>
+      <w:r>
+        <w:rPr>
+          <w:sz w:val="20"/>
+          <w:szCs w:val="20"/>
+          <w:lang w:val="en-US"/>
+        </w:rPr>
+        <w:lastRenderedPageBreak/>
+        <w:t>your account(s) with SSP  (including any future accounts), to SSP’s subsidiaries, any company that is or may in the future become a related company to SSP, any Investor or the Investor’s head offices, representative and branch offices, and/or any related or associated company of the Investors in any jurisdiction, agents, auditors, legal counsels, insurers, professional advisors, or representatives, the Central Credit Unit, or any other banking or regulatory authorities. This disclosure may also include any co-debtor, joint account holder, guarantor, charger, surety, security party, any party making a claim under a third-party payment instrument or trade document, or any other person who has undertaken liability for the facility(ies) with SSP or under any law or legal process, or in connection with any action, suit, or proceeding relating to the facility(ies).</w:t>
       </w:r>
     </w:p>
     <w:p>
@@ -12954,7 +13006,6 @@
           <w:szCs w:val="20"/>
           <w:lang w:val="en-US"/>
         </w:rPr>
-        <w:lastRenderedPageBreak/>
         <w:t>The Issuer may not assign or transfer any of its rights or obligations under the Facility without the prior written consent of SSP.</w:t>
       </w:r>
     </w:p>
@@ -13152,6 +13203,7 @@
           <w:szCs w:val="20"/>
           <w:lang w:val="en-US"/>
         </w:rPr>
+        <w:lastRenderedPageBreak/>
         <w:t>Altering the spread or quantum of the profit above the applicable benchmark profit rate;</w:t>
       </w:r>
     </w:p>
@@ -13511,7 +13563,6 @@
           <w:szCs w:val="20"/>
           <w:lang w:val="en-US"/>
         </w:rPr>
-        <w:lastRenderedPageBreak/>
         <w:t>RIGHTS OF SSP</w:t>
       </w:r>
     </w:p>
@@ -13628,6 +13679,7 @@
           <w:szCs w:val="20"/>
           <w:lang w:val="en-US"/>
         </w:rPr>
+        <w:lastRenderedPageBreak/>
         <w:t>SSP has the right, at any time, to withdraw or suspend the financing facility(ies) or any part thereof, even if the facility or security documentation has been completed. This may occur upon the SSP’s assessment that any event has occurred which, in the SSP’s opinion, may adversely affect your financial position, hinder the conduct of your business operations in accordance with sound financial and commercial practices, or jeopardize SSP’s security position. SSP’s decision regarding this matter will be final and conclusive.</w:t>
       </w:r>
     </w:p>
@@ -13807,16 +13859,7 @@
           <w:szCs w:val="20"/>
           <w:lang w:val="en-US"/>
         </w:rPr>
-        <w:t xml:space="preserve">SSP’s obligation to continue providing the facility(ies) to you, subject to the terms and conditions herein and provided there is no default on your part, shall be contingent upon the absence of any changes in circumstances that may materially affect SSP’s or Investors' ability to provide the </w:t>
-      </w:r>
-      <w:r>
-        <w:rPr>
-          <w:sz w:val="20"/>
-          <w:szCs w:val="20"/>
-          <w:lang w:val="en-US"/>
-        </w:rPr>
-        <w:lastRenderedPageBreak/>
-        <w:t>facility(ies) or that may result in an increase in the costs incurred by SSP or Investors in doing so.</w:t>
+        <w:t>SSP’s obligation to continue providing the facility(ies) to you, subject to the terms and conditions herein and provided there is no default on your part, shall be contingent upon the absence of any changes in circumstances that may materially affect SSP’s or Investors' ability to provide the facility(ies) or that may result in an increase in the costs incurred by SSP or Investors in doing so.</w:t>
       </w:r>
     </w:p>
     <w:p>
@@ -13891,7 +13934,16 @@
           <w:szCs w:val="20"/>
           <w:lang w:val="en-US"/>
         </w:rPr>
-        <w:t>In the event that any indebtedness incurred by the Issuer, the Issuer’s security party, or any entity within the Issuer’s group of companies, including the Issuer’s parent company and/or subsidiaries, becomes due or is capable of being declared due prior to its stated maturity, or if any guarantee provided by the Issuer, the Issuer’s security party, or any entity within the Issuer’s group, including the Issuer’s parent company and/or subsidiaries, is not discharged at maturity or when called upon, or if the Issuer, the Issuer’s security party, or any entity within the Issuer’s group, including the Issuer’s parent company and/or subsidiaries, defaults under or breaches any agreement or instrument pertaining to such indebtedness or guarantee, then, in such circumstances, the facility(ies) and all amounts owing under such account(s) or any other facility shall immediately become due and payable.</w:t>
+        <w:t xml:space="preserve">In the event that any indebtedness incurred by the Issuer, the Issuer’s security party, or any entity within the Issuer’s group of companies, including the Issuer’s parent company and/or subsidiaries, becomes due or is capable of being declared due prior to its stated maturity, or if any guarantee provided by the Issuer, the Issuer’s security party, or any entity within the Issuer’s </w:t>
+      </w:r>
+      <w:r>
+        <w:rPr>
+          <w:sz w:val="20"/>
+          <w:szCs w:val="20"/>
+          <w:lang w:val="en-US"/>
+        </w:rPr>
+        <w:lastRenderedPageBreak/>
+        <w:t>group, including the Issuer’s parent company and/or subsidiaries, is not discharged at maturity or when called upon, or if the Issuer, the Issuer’s security party, or any entity within the Issuer’s group, including the Issuer’s parent company and/or subsidiaries, defaults under or breaches any agreement or instrument pertaining to such indebtedness or guarantee, then, in such circumstances, the facility(ies) and all amounts owing under such account(s) or any other facility shall immediately become due and payable.</w:t>
       </w:r>
     </w:p>
     <w:p>
@@ -14116,16 +14168,7 @@
           <w:szCs w:val="20"/>
           <w:lang w:val="en-US"/>
         </w:rPr>
-        <w:t xml:space="preserve">SSP’s rights under this Facility are cumulative and may be exercised as often as deemed appropriate, in addition to any rights under applicable law. These rights cannot be waived or varied except by express written agreement. Failure or delay in exercising any right does not </w:t>
-      </w:r>
-      <w:r>
-        <w:rPr>
-          <w:sz w:val="20"/>
-          <w:szCs w:val="20"/>
-          <w:lang w:val="en-US"/>
-        </w:rPr>
-        <w:lastRenderedPageBreak/>
-        <w:t>constitute a waiver, and any partial exercise of a right does not preclude further exercise of that right. No conduct or negotiation by SSP or Investors shall suspend or vary any right.</w:t>
+        <w:t>SSP’s rights under this Facility are cumulative and may be exercised as often as deemed appropriate, in addition to any rights under applicable law. These rights cannot be waived or varied except by express written agreement. Failure or delay in exercising any right does not constitute a waiver, and any partial exercise of a right does not preclude further exercise of that right. No conduct or negotiation by SSP or Investors shall suspend or vary any right.</w:t>
       </w:r>
     </w:p>
     <w:p>
@@ -14201,7 +14244,16 @@
           <w:szCs w:val="20"/>
           <w:lang w:val="en-US"/>
         </w:rPr>
-        <w:t>Any notice or communication may be given in writing and delivered personally, sent by post to the address provided herein, transmitted electronically, through our website, or by any other means designated by SSP from time to time. Proof of posting or dispatch shall be deemed proof of receipt as follows:</w:t>
+        <w:t xml:space="preserve">Any notice or communication may be given in writing and delivered personally, sent by post to the address provided herein, transmitted electronically, through our website, or by any other </w:t>
+      </w:r>
+      <w:r>
+        <w:rPr>
+          <w:sz w:val="20"/>
+          <w:szCs w:val="20"/>
+          <w:lang w:val="en-US"/>
+        </w:rPr>
+        <w:lastRenderedPageBreak/>
+        <w:t>means designated by SSP from time to time. Proof of posting or dispatch shall be deemed proof of receipt as follows:</w:t>
       </w:r>
     </w:p>
     <w:p>
@@ -14532,42 +14584,50 @@
           <w:szCs w:val="20"/>
           <w:lang w:val="en-US"/>
         </w:rPr>
+        <w:t>STRATEGIC TRADE ACT 2010</w:t>
+      </w:r>
+    </w:p>
+    <w:p>
+      <w:pPr>
+        <w:pStyle w:val="NoSpacing"/>
+        <w:spacing w:line="360" w:lineRule="auto"/>
+        <w:ind w:left="567"/>
+        <w:jc w:val="both"/>
+        <w:rPr>
+          <w:sz w:val="20"/>
+          <w:szCs w:val="20"/>
+          <w:lang w:val="en-US"/>
+        </w:rPr>
+      </w:pPr>
+    </w:p>
+    <w:p>
+      <w:pPr>
+        <w:pStyle w:val="NoSpacing"/>
+        <w:spacing w:line="360" w:lineRule="auto"/>
+        <w:ind w:left="567"/>
+        <w:jc w:val="both"/>
+        <w:rPr>
+          <w:sz w:val="20"/>
+          <w:szCs w:val="20"/>
+          <w:lang w:val="en-US"/>
+        </w:rPr>
+      </w:pPr>
+      <w:r>
+        <w:rPr>
+          <w:sz w:val="20"/>
+          <w:szCs w:val="20"/>
+          <w:lang w:val="en-US"/>
+        </w:rPr>
+        <w:t xml:space="preserve">The Issuer hereby agrees, covenants, and undertakes that the facility(ies) provided shall not be used for transactions involving goods, items, or services classified as strategic items under the Strategic Trade Act 2010. This includes, but is not limited to, the importation, exportation, </w:t>
+      </w:r>
+      <w:r>
+        <w:rPr>
+          <w:sz w:val="20"/>
+          <w:szCs w:val="20"/>
+          <w:lang w:val="en-US"/>
+        </w:rPr>
         <w:lastRenderedPageBreak/>
-        <w:t>STRATEGIC TRADE ACT 2010</w:t>
-      </w:r>
-    </w:p>
-    <w:p>
-      <w:pPr>
-        <w:pStyle w:val="NoSpacing"/>
-        <w:spacing w:line="360" w:lineRule="auto"/>
-        <w:ind w:left="567"/>
-        <w:jc w:val="both"/>
-        <w:rPr>
-          <w:sz w:val="20"/>
-          <w:szCs w:val="20"/>
-          <w:lang w:val="en-US"/>
-        </w:rPr>
-      </w:pPr>
-    </w:p>
-    <w:p>
-      <w:pPr>
-        <w:pStyle w:val="NoSpacing"/>
-        <w:spacing w:line="360" w:lineRule="auto"/>
-        <w:ind w:left="567"/>
-        <w:jc w:val="both"/>
-        <w:rPr>
-          <w:sz w:val="20"/>
-          <w:szCs w:val="20"/>
-          <w:lang w:val="en-US"/>
-        </w:rPr>
-      </w:pPr>
-      <w:r>
-        <w:rPr>
-          <w:sz w:val="20"/>
-          <w:szCs w:val="20"/>
-          <w:lang w:val="en-US"/>
-        </w:rPr>
-        <w:t>The Issuer hereby agrees, covenants, and undertakes that the facility(ies) provided shall not be used for transactions involving goods, items, or services classified as strategic items under the Strategic Trade Act 2010. This includes, but is not limited to, the importation, exportation, transshipment, brokering, marketing, distribution, or any other transactions involving such strategic items, or any actions that contravene the Strategic Trade Act 2010. The Issuer further agrees that SSP may, at its sole discretion and without assigning any reasons, decline to disburse the facility(ies), allow further drawdowns, make payments, process the payment of the facility(ies), or accept or negotiate any trade facilities requested by the Issuer, if such transactions involve strategic items. SSP reserves the right to declare an event of default and recall or cancel the facility(ies) as a result of such transactions. The Issuer shall absolve SSP from any liability arising from such transactions and shall indemnify and keep SSP fully indemnified against any fines, penalties, or sanctions imposed SSP as a result of the Issuer’s contravention of the Strategic Trade Act 2010, or any action that causes SSP to contravene the Act.</w:t>
+        <w:t>transshipment, brokering, marketing, distribution, or any other transactions involving such strategic items, or any actions that contravene the Strategic Trade Act 2010. The Issuer further agrees that SSP may, at its sole discretion and without assigning any reasons, decline to disburse the facility(ies), allow further drawdowns, make payments, process the payment of the facility(ies), or accept or negotiate any trade facilities requested by the Issuer, if such transactions involve strategic items. SSP reserves the right to declare an event of default and recall or cancel the facility(ies) as a result of such transactions. The Issuer shall absolve SSP from any liability arising from such transactions and shall indemnify and keep SSP fully indemnified against any fines, penalties, or sanctions imposed SSP as a result of the Issuer’s contravention of the Strategic Trade Act 2010, or any action that causes SSP to contravene the Act.</w:t>
       </w:r>
     </w:p>
     <w:p>
@@ -14850,41 +14910,41 @@
           <w:szCs w:val="20"/>
           <w:lang w:val="en-US"/>
         </w:rPr>
+        <w:t>PERSONAL DATA PROTECTION ACT 2010</w:t>
+      </w:r>
+    </w:p>
+    <w:p>
+      <w:pPr>
+        <w:pStyle w:val="NoSpacing"/>
+        <w:spacing w:line="360" w:lineRule="auto"/>
+        <w:ind w:left="567"/>
+        <w:jc w:val="both"/>
+        <w:rPr>
+          <w:sz w:val="20"/>
+          <w:szCs w:val="20"/>
+          <w:lang w:val="en-US"/>
+        </w:rPr>
+      </w:pPr>
+    </w:p>
+    <w:p>
+      <w:pPr>
+        <w:pStyle w:val="NoSpacing"/>
+        <w:spacing w:line="360" w:lineRule="auto"/>
+        <w:ind w:left="567"/>
+        <w:jc w:val="both"/>
+        <w:rPr>
+          <w:sz w:val="20"/>
+          <w:szCs w:val="20"/>
+          <w:lang w:val="en-US"/>
+        </w:rPr>
+      </w:pPr>
+      <w:r>
+        <w:rPr>
+          <w:sz w:val="20"/>
+          <w:szCs w:val="20"/>
+          <w:lang w:val="en-US"/>
+        </w:rPr>
         <w:lastRenderedPageBreak/>
-        <w:t>PERSONAL DATA PROTECTION ACT 2010</w:t>
-      </w:r>
-    </w:p>
-    <w:p>
-      <w:pPr>
-        <w:pStyle w:val="NoSpacing"/>
-        <w:spacing w:line="360" w:lineRule="auto"/>
-        <w:ind w:left="567"/>
-        <w:jc w:val="both"/>
-        <w:rPr>
-          <w:sz w:val="20"/>
-          <w:szCs w:val="20"/>
-          <w:lang w:val="en-US"/>
-        </w:rPr>
-      </w:pPr>
-    </w:p>
-    <w:p>
-      <w:pPr>
-        <w:pStyle w:val="NoSpacing"/>
-        <w:spacing w:line="360" w:lineRule="auto"/>
-        <w:ind w:left="567"/>
-        <w:jc w:val="both"/>
-        <w:rPr>
-          <w:sz w:val="20"/>
-          <w:szCs w:val="20"/>
-          <w:lang w:val="en-US"/>
-        </w:rPr>
-      </w:pPr>
-      <w:r>
-        <w:rPr>
-          <w:sz w:val="20"/>
-          <w:szCs w:val="20"/>
-          <w:lang w:val="en-US"/>
-        </w:rPr>
         <w:t>The Issuer may be required to provide personal data and information regarding the Issuer, the Issuer’s guarantor, and/or any third-party security providers, including but not limited to directors, shareholders, employees, representatives, or any other individuals (“the Individual”), in connection with the Issuer’s contract and/or transactions with SSP (“Personal Data”).</w:t>
       </w:r>
     </w:p>
@@ -15999,7 +16059,16 @@
           <w:szCs w:val="20"/>
           <w:lang w:val="en-US"/>
         </w:rPr>
-        <w:t>Notwithstanding the foregoing provisions of Clause E, the Issuer expressly agrees that if the proceeds realized by SSP from the security documents, after deducting applicable fees, costs, taxes, and other outgoings, are less than the amount due to the SSP and/or Investors, the Issuer shall, upon demand, pay the difference. The Issuer shall also be liable for all costs incurred by SSP and/or Investors, as determined by SSP (whose determination shall be conclusive and binding, save for manifest error), including interest incurred by SSP and/or Investors in relation to funds borrowed or deposits made to cover such deficiency, calculated up to the date of payment, both before and after judgment.</w:t>
+        <w:t xml:space="preserve">Notwithstanding the foregoing provisions of Clause E, the Issuer expressly agrees that if the proceeds realized by SSP from the security documents, after deducting applicable fees, costs, taxes, and other outgoings, are less than the amount due to the SSP and/or Investors, the Issuer shall, upon demand, pay the difference. The Issuer shall also be liable for all costs incurred by SSP and/or Investors, as determined by SSP (whose determination shall be conclusive and binding, save for manifest error), including interest incurred by </w:t>
+      </w:r>
+      <w:r>
+        <w:rPr>
+          <w:sz w:val="20"/>
+          <w:szCs w:val="20"/>
+          <w:lang w:val="en-US"/>
+        </w:rPr>
+        <w:lastRenderedPageBreak/>
+        <w:t>SSP and/or Investors in relation to funds borrowed or deposits made to cover such deficiency, calculated up to the date of payment, both before and after judgment.</w:t>
       </w:r>
     </w:p>
     <w:p>
@@ -16024,7 +16093,6 @@
           <w:szCs w:val="20"/>
           <w:lang w:val="en-US"/>
         </w:rPr>
-        <w:lastRenderedPageBreak/>
         <w:t>Concurrent Proceedings</w:t>
       </w:r>
     </w:p>
@@ -16099,12 +16167,8 @@
       </w:r>
     </w:p>
     <w:sectPr>
-      <w:headerReference w:type="even" r:id="rId16"/>
       <w:headerReference w:type="default" r:id="rId12"/>
-      <w:footerReference w:type="even" r:id="rId17"/>
       <w:footerReference w:type="default" r:id="rId13"/>
-      <w:headerReference w:type="first" r:id="rId18"/>
-      <w:footerReference w:type="first" r:id="rId19"/>
       <w:footnotePr>
         <w:numFmt w:val="chicago"/>
         <w:numRestart w:val="eachPage"/>
@@ -16151,16 +16215,6 @@
 </file>
 
 <file path=word/footer1.xml><?xml version="1.0" encoding="utf-8"?>
-<w:ftr xmlns:wpc="http://schemas.microsoft.com/office/word/2010/wordprocessingCanvas" xmlns:cx="http://schemas.microsoft.com/office/drawing/2014/chartex" xmlns:cx1="http://schemas.microsoft.com/office/drawing/2015/9/8/chartex" xmlns:cx2="http://schemas.microsoft.com/office/drawing/2015/10/21/chartex" xmlns:cx3="http://schemas.microsoft.com/office/drawing/2016/5/9/chartex" xmlns:cx4="http://schemas.microsoft.com/office/drawing/2016/5/10/chartex" xmlns:cx5="http://schemas.microsoft.com/office/drawing/2016/5/11/chartex" xmlns:cx6="http://schemas.microsoft.com/office/drawing/2016/5/12/chartex" xmlns:cx7="http://schemas.microsoft.com/office/drawing/2016/5/13/chartex" xmlns:cx8="http://schemas.microsoft.com/office/drawing/2016/5/14/chartex" xmlns:mc="http://schemas.openxmlformats.org/markup-compatibility/2006" xmlns:aink="http://schemas.microsoft.com/office/drawing/2016/ink" xmlns:am3d="http://schemas.microsoft.com/office/drawing/2017/model3d" xmlns:o="urn:schemas-microsoft-com:office:office" xmlns:oel="http://schemas.microsoft.com/office/2019/extlst" xmlns:r="http://schemas.openxmlformats.org/officeDocument/2006/relationships" xmlns:m="http://schemas.openxmlformats.org/officeDocument/2006/math" xmlns:v="urn:schemas-microsoft-com:vml" xmlns:wp14="http://schemas.microsoft.com/office/word/2010/wordprocessingDrawing" xmlns:wp="http://schemas.openxmlformats.org/drawingml/2006/wordprocessingDrawing" xmlns:w10="urn:schemas-microsoft-com:office:word" xmlns:w="http://schemas.openxmlformats.org/wordprocessingml/2006/main" xmlns:w14="http://schemas.microsoft.com/office/word/2010/wordml" xmlns:w15="http://schemas.microsoft.com/office/word/2012/wordml" xmlns:w16cex="http://schemas.microsoft.com/office/word/2018/wordml/cex" xmlns:w16cid="http://schemas.microsoft.com/office/word/2016/wordml/cid" xmlns:w16="http://schemas.microsoft.com/office/word/2018/wordml" xmlns:w16du="http://schemas.microsoft.com/office/word/2023/wordml/word16du" xmlns:w16sdtdh="http://schemas.microsoft.com/office/word/2020/wordml/sdtdatahash" xmlns:w16sdtfl="http://schemas.microsoft.com/office/word/2024/wordml/sdtformatlock" xmlns:w16se="http://schemas.microsoft.com/office/word/2015/wordml/symex" xmlns:wpg="http://schemas.microsoft.com/office/word/2010/wordprocessingGroup" xmlns:wpi="http://schemas.microsoft.com/office/word/2010/wordprocessingInk" xmlns:wne="http://schemas.microsoft.com/office/word/2006/wordml" xmlns:wps="http://schemas.microsoft.com/office/word/2010/wordprocessingShape" mc:Ignorable="w14 w15 w16se w16cid w16 w16cex w16sdtdh w16sdtfl w16du wp14">
-  <w:p>
-    <w:pPr>
-      <w:pStyle w:val="Footer"/>
-    </w:pPr>
-  </w:p>
-</w:ftr>
-</file>
-
-<file path=word/footer2.xml><?xml version="1.0" encoding="utf-8"?>
 <w:ftr xmlns:wpc="http://schemas.microsoft.com/office/word/2010/wordprocessingCanvas" xmlns:cx="http://schemas.microsoft.com/office/drawing/2014/chartex" xmlns:cx1="http://schemas.microsoft.com/office/drawing/2015/9/8/chartex" xmlns:cx2="http://schemas.microsoft.com/office/drawing/2015/10/21/chartex" xmlns:cx3="http://schemas.microsoft.com/office/drawing/2016/5/9/chartex" xmlns:cx4="http://schemas.microsoft.com/office/drawing/2016/5/10/chartex" xmlns:cx5="http://schemas.microsoft.com/office/drawing/2016/5/11/chartex" xmlns:cx6="http://schemas.microsoft.com/office/drawing/2016/5/12/chartex" xmlns:cx7="http://schemas.microsoft.com/office/drawing/2016/5/13/chartex" xmlns:cx8="http://schemas.microsoft.com/office/drawing/2016/5/14/chartex" xmlns:mc="http://schemas.openxmlformats.org/markup-compatibility/2006" xmlns:aink="http://schemas.microsoft.com/office/drawing/2016/ink" xmlns:am3d="http://schemas.microsoft.com/office/drawing/2017/model3d" xmlns:o="urn:schemas-microsoft-com:office:office" xmlns:oel="http://schemas.microsoft.com/office/2019/extlst" xmlns:r="http://schemas.openxmlformats.org/officeDocument/2006/relationships" xmlns:m="http://schemas.openxmlformats.org/officeDocument/2006/math" xmlns:v="urn:schemas-microsoft-com:vml" xmlns:wp14="http://schemas.microsoft.com/office/word/2010/wordprocessingDrawing" xmlns:wp="http://schemas.openxmlformats.org/drawingml/2006/wordprocessingDrawing" xmlns:w10="urn:schemas-microsoft-com:office:word" xmlns:w="http://schemas.openxmlformats.org/wordprocessingml/2006/main" xmlns:w14="http://schemas.microsoft.com/office/word/2010/wordml" xmlns:w15="http://schemas.microsoft.com/office/word/2012/wordml" xmlns:w16cex="http://schemas.microsoft.com/office/word/2018/wordml/cex" xmlns:w16cid="http://schemas.microsoft.com/office/word/2016/wordml/cid" xmlns:w16="http://schemas.microsoft.com/office/word/2018/wordml" xmlns:w16du="http://schemas.microsoft.com/office/word/2023/wordml/word16du" xmlns:w16sdtdh="http://schemas.microsoft.com/office/word/2020/wordml/sdtdatahash" xmlns:w16sdtfl="http://schemas.microsoft.com/office/word/2024/wordml/sdtformatlock" xmlns:w16se="http://schemas.microsoft.com/office/word/2015/wordml/symex" xmlns:wpg="http://schemas.microsoft.com/office/word/2010/wordprocessingGroup" xmlns:wpi="http://schemas.microsoft.com/office/word/2010/wordprocessingInk" xmlns:wne="http://schemas.microsoft.com/office/word/2006/wordml" xmlns:wps="http://schemas.microsoft.com/office/word/2010/wordprocessingShape" mc:Ignorable="w14 w15 w16se w16cid w16 w16cex w16sdtdh w16sdtfl w16du wp14">
   <w:sdt>
     <w:sdtPr>
@@ -16409,16 +16463,6 @@
 </w:ftr>
 </file>
 
-<file path=word/footer3.xml><?xml version="1.0" encoding="utf-8"?>
-<w:ftr xmlns:wpc="http://schemas.microsoft.com/office/word/2010/wordprocessingCanvas" xmlns:cx="http://schemas.microsoft.com/office/drawing/2014/chartex" xmlns:cx1="http://schemas.microsoft.com/office/drawing/2015/9/8/chartex" xmlns:cx2="http://schemas.microsoft.com/office/drawing/2015/10/21/chartex" xmlns:cx3="http://schemas.microsoft.com/office/drawing/2016/5/9/chartex" xmlns:cx4="http://schemas.microsoft.com/office/drawing/2016/5/10/chartex" xmlns:cx5="http://schemas.microsoft.com/office/drawing/2016/5/11/chartex" xmlns:cx6="http://schemas.microsoft.com/office/drawing/2016/5/12/chartex" xmlns:cx7="http://schemas.microsoft.com/office/drawing/2016/5/13/chartex" xmlns:cx8="http://schemas.microsoft.com/office/drawing/2016/5/14/chartex" xmlns:mc="http://schemas.openxmlformats.org/markup-compatibility/2006" xmlns:aink="http://schemas.microsoft.com/office/drawing/2016/ink" xmlns:am3d="http://schemas.microsoft.com/office/drawing/2017/model3d" xmlns:o="urn:schemas-microsoft-com:office:office" xmlns:oel="http://schemas.microsoft.com/office/2019/extlst" xmlns:r="http://schemas.openxmlformats.org/officeDocument/2006/relationships" xmlns:m="http://schemas.openxmlformats.org/officeDocument/2006/math" xmlns:v="urn:schemas-microsoft-com:vml" xmlns:wp14="http://schemas.microsoft.com/office/word/2010/wordprocessingDrawing" xmlns:wp="http://schemas.openxmlformats.org/drawingml/2006/wordprocessingDrawing" xmlns:w10="urn:schemas-microsoft-com:office:word" xmlns:w="http://schemas.openxmlformats.org/wordprocessingml/2006/main" xmlns:w14="http://schemas.microsoft.com/office/word/2010/wordml" xmlns:w15="http://schemas.microsoft.com/office/word/2012/wordml" xmlns:w16cex="http://schemas.microsoft.com/office/word/2018/wordml/cex" xmlns:w16cid="http://schemas.microsoft.com/office/word/2016/wordml/cid" xmlns:w16="http://schemas.microsoft.com/office/word/2018/wordml" xmlns:w16du="http://schemas.microsoft.com/office/word/2023/wordml/word16du" xmlns:w16sdtdh="http://schemas.microsoft.com/office/word/2020/wordml/sdtdatahash" xmlns:w16sdtfl="http://schemas.microsoft.com/office/word/2024/wordml/sdtformatlock" xmlns:w16se="http://schemas.microsoft.com/office/word/2015/wordml/symex" xmlns:wpg="http://schemas.microsoft.com/office/word/2010/wordprocessingGroup" xmlns:wpi="http://schemas.microsoft.com/office/word/2010/wordprocessingInk" xmlns:wne="http://schemas.microsoft.com/office/word/2006/wordml" xmlns:wps="http://schemas.microsoft.com/office/word/2010/wordprocessingShape" mc:Ignorable="w14 w15 w16se w16cid w16 w16cex w16sdtdh w16sdtfl w16du wp14">
-  <w:p>
-    <w:pPr>
-      <w:pStyle w:val="Footer"/>
-    </w:pPr>
-  </w:p>
-</w:ftr>
-</file>
-
 <file path=word/footnotes.xml><?xml version="1.0" encoding="utf-8"?>
 <w:footnotes xmlns:wpc="http://schemas.microsoft.com/office/word/2010/wordprocessingCanvas" xmlns:cx="http://schemas.microsoft.com/office/drawing/2014/chartex" xmlns:cx1="http://schemas.microsoft.com/office/drawing/2015/9/8/chartex" xmlns:cx2="http://schemas.microsoft.com/office/drawing/2015/10/21/chartex" xmlns:cx3="http://schemas.microsoft.com/office/drawing/2016/5/9/chartex" xmlns:cx4="http://schemas.microsoft.com/office/drawing/2016/5/10/chartex" xmlns:cx5="http://schemas.microsoft.com/office/drawing/2016/5/11/chartex" xmlns:cx6="http://schemas.microsoft.com/office/drawing/2016/5/12/chartex" xmlns:cx7="http://schemas.microsoft.com/office/drawing/2016/5/13/chartex" xmlns:cx8="http://schemas.microsoft.com/office/drawing/2016/5/14/chartex" xmlns:mc="http://schemas.openxmlformats.org/markup-compatibility/2006" xmlns:aink="http://schemas.microsoft.com/office/drawing/2016/ink" xmlns:am3d="http://schemas.microsoft.com/office/drawing/2017/model3d" xmlns:o="urn:schemas-microsoft-com:office:office" xmlns:oel="http://schemas.microsoft.com/office/2019/extlst" xmlns:r="http://schemas.openxmlformats.org/officeDocument/2006/relationships" xmlns:m="http://schemas.openxmlformats.org/officeDocument/2006/math" xmlns:v="urn:schemas-microsoft-com:vml" xmlns:wp14="http://schemas.microsoft.com/office/word/2010/wordprocessingDrawing" xmlns:wp="http://schemas.openxmlformats.org/drawingml/2006/wordprocessingDrawing" xmlns:w10="urn:schemas-microsoft-com:office:word" xmlns:w="http://schemas.openxmlformats.org/wordprocessingml/2006/main" xmlns:w14="http://schemas.microsoft.com/office/word/2010/wordml" xmlns:w15="http://schemas.microsoft.com/office/word/2012/wordml" xmlns:w16cex="http://schemas.microsoft.com/office/word/2018/wordml/cex" xmlns:w16cid="http://schemas.microsoft.com/office/word/2016/wordml/cid" xmlns:w16="http://schemas.microsoft.com/office/word/2018/wordml" xmlns:w16du="http://schemas.microsoft.com/office/word/2023/wordml/word16du" xmlns:w16sdtdh="http://schemas.microsoft.com/office/word/2020/wordml/sdtdatahash" xmlns:w16sdtfl="http://schemas.microsoft.com/office/word/2024/wordml/sdtformatlock" xmlns:w16se="http://schemas.microsoft.com/office/word/2015/wordml/symex" xmlns:wpg="http://schemas.microsoft.com/office/word/2010/wordprocessingGroup" xmlns:wpi="http://schemas.microsoft.com/office/word/2010/wordprocessingInk" xmlns:wne="http://schemas.microsoft.com/office/word/2006/wordml" xmlns:wps="http://schemas.microsoft.com/office/word/2010/wordprocessingShape" mc:Ignorable="w14 w15 w16se w16cid w16 w16cex w16sdtdh w16sdtfl w16du wp14">
   <w:footnote w:type="separator" w:id="-1">
@@ -16456,47 +16500,28 @@
   <w:p>
     <w:pPr>
       <w:pStyle w:val="Header"/>
-    </w:pPr>
-  </w:p>
-</w:hdr>
-</file>
-
-<file path=word/header2.xml><?xml version="1.0" encoding="utf-8"?>
-<w:hdr xmlns:wpc="http://schemas.microsoft.com/office/word/2010/wordprocessingCanvas" xmlns:cx="http://schemas.microsoft.com/office/drawing/2014/chartex" xmlns:cx1="http://schemas.microsoft.com/office/drawing/2015/9/8/chartex" xmlns:cx2="http://schemas.microsoft.com/office/drawing/2015/10/21/chartex" xmlns:cx3="http://schemas.microsoft.com/office/drawing/2016/5/9/chartex" xmlns:cx4="http://schemas.microsoft.com/office/drawing/2016/5/10/chartex" xmlns:cx5="http://schemas.microsoft.com/office/drawing/2016/5/11/chartex" xmlns:cx6="http://schemas.microsoft.com/office/drawing/2016/5/12/chartex" xmlns:cx7="http://schemas.microsoft.com/office/drawing/2016/5/13/chartex" xmlns:cx8="http://schemas.microsoft.com/office/drawing/2016/5/14/chartex" xmlns:mc="http://schemas.openxmlformats.org/markup-compatibility/2006" xmlns:aink="http://schemas.microsoft.com/office/drawing/2016/ink" xmlns:am3d="http://schemas.microsoft.com/office/drawing/2017/model3d" xmlns:o="urn:schemas-microsoft-com:office:office" xmlns:oel="http://schemas.microsoft.com/office/2019/extlst" xmlns:r="http://schemas.openxmlformats.org/officeDocument/2006/relationships" xmlns:m="http://schemas.openxmlformats.org/officeDocument/2006/math" xmlns:v="urn:schemas-microsoft-com:vml" xmlns:wp14="http://schemas.microsoft.com/office/word/2010/wordprocessingDrawing" xmlns:wp="http://schemas.openxmlformats.org/drawingml/2006/wordprocessingDrawing" xmlns:w10="urn:schemas-microsoft-com:office:word" xmlns:w="http://schemas.openxmlformats.org/wordprocessingml/2006/main" xmlns:w14="http://schemas.microsoft.com/office/word/2010/wordml" xmlns:w15="http://schemas.microsoft.com/office/word/2012/wordml" xmlns:w16cex="http://schemas.microsoft.com/office/word/2018/wordml/cex" xmlns:w16cid="http://schemas.microsoft.com/office/word/2016/wordml/cid" xmlns:w16="http://schemas.microsoft.com/office/word/2018/wordml" xmlns:w16du="http://schemas.microsoft.com/office/word/2023/wordml/word16du" xmlns:w16sdtdh="http://schemas.microsoft.com/office/word/2020/wordml/sdtdatahash" xmlns:w16sdtfl="http://schemas.microsoft.com/office/word/2024/wordml/sdtformatlock" xmlns:w16se="http://schemas.microsoft.com/office/word/2015/wordml/symex" xmlns:wpg="http://schemas.microsoft.com/office/word/2010/wordprocessingGroup" xmlns:wpi="http://schemas.microsoft.com/office/word/2010/wordprocessingInk" xmlns:wne="http://schemas.microsoft.com/office/word/2006/wordml" xmlns:wps="http://schemas.microsoft.com/office/word/2010/wordprocessingShape" mc:Ignorable="w14 w15 w16se w16cid w16 w16cex w16sdtdh w16sdtfl w16du wp14">
-  <w:p>
-    <w:pPr>
-      <w:pStyle w:val="Header"/>
       <w:jc w:val="center"/>
+      <w:rPr>
+        <w:noProof/>
+      </w:rPr>
     </w:pPr>
     <w:r>
       <w:rPr>
         <w:noProof/>
       </w:rPr>
       <w:drawing>
-        <wp:anchor distT="0" distB="0" distL="114300" distR="114300" simplePos="0" relativeHeight="251658240" behindDoc="0" locked="0" layoutInCell="1" allowOverlap="1" wp14:anchorId="0CEF0E7B" wp14:editId="60E98F0D">
+        <wp:anchor distT="0" distB="0" distL="114300" distR="114300" simplePos="0" relativeHeight="251658240" behindDoc="0" locked="0" layoutInCell="1" allowOverlap="1" wp14:anchorId="47F2249E" wp14:editId="27FC98A4">
           <wp:simplePos x="0" y="0"/>
           <wp:positionH relativeFrom="margin">
-            <wp:align>left</wp:align>
+            <wp:posOffset>-117502</wp:posOffset>
           </wp:positionH>
           <wp:positionV relativeFrom="paragraph">
-            <wp:posOffset>6985</wp:posOffset>
+            <wp:posOffset>6350</wp:posOffset>
           </wp:positionV>
           <wp:extent cx="2167343" cy="812753"/>
           <wp:effectExtent l="0" t="0" r="0" b="0"/>
-          <wp:wrapThrough wrapText="bothSides">
-            <wp:wrapPolygon edited="0">
-              <wp:start x="1519" y="5573"/>
-              <wp:lineTo x="570" y="9626"/>
-              <wp:lineTo x="380" y="11146"/>
-              <wp:lineTo x="949" y="15706"/>
-              <wp:lineTo x="3987" y="15706"/>
-              <wp:lineTo x="20125" y="14186"/>
-              <wp:lineTo x="20125" y="6586"/>
-              <wp:lineTo x="3418" y="5573"/>
-              <wp:lineTo x="1519" y="5573"/>
-            </wp:wrapPolygon>
-          </wp:wrapThrough>
-          <wp:docPr id="1312371315" name="Picture 3"/>
+          <wp:wrapNone/>
+          <wp:docPr id="1351566302" name="Picture 3"/>
           <wp:cNvGraphicFramePr>
             <a:graphicFrameLocks xmlns:a="http://schemas.openxmlformats.org/drawingml/2006/main" noChangeAspect="1"/>
           </wp:cNvGraphicFramePr>
@@ -16544,6 +16569,12 @@
   <w:p>
     <w:pPr>
       <w:pStyle w:val="Header"/>
+      <w:jc w:val="center"/>
+    </w:pPr>
+  </w:p>
+  <w:p>
+    <w:pPr>
+      <w:pStyle w:val="Header"/>
       <w:jc w:val="right"/>
       <w:rPr>
         <w:i/>
@@ -16553,16 +16584,6 @@
         <w:szCs w:val="18"/>
       </w:rPr>
     </w:pPr>
-    <w:r>
-      <w:rPr>
-        <w:i/>
-        <w:iCs/>
-        <w:color w:val="808080" w:themeColor="background1" w:themeShade="80"/>
-        <w:sz w:val="18"/>
-        <w:szCs w:val="18"/>
-      </w:rPr>
-      <w:t>Draft by Messrs Abu Talib Shahrom (ATS)</w:t>
-    </w:r>
   </w:p>
   <w:p>
     <w:pPr>
@@ -16593,16 +16614,6 @@
 </w:hdr>
 </file>
 
-<file path=word/header3.xml><?xml version="1.0" encoding="utf-8"?>
-<w:hdr xmlns:wpc="http://schemas.microsoft.com/office/word/2010/wordprocessingCanvas" xmlns:cx="http://schemas.microsoft.com/office/drawing/2014/chartex" xmlns:cx1="http://schemas.microsoft.com/office/drawing/2015/9/8/chartex" xmlns:cx2="http://schemas.microsoft.com/office/drawing/2015/10/21/chartex" xmlns:cx3="http://schemas.microsoft.com/office/drawing/2016/5/9/chartex" xmlns:cx4="http://schemas.microsoft.com/office/drawing/2016/5/10/chartex" xmlns:cx5="http://schemas.microsoft.com/office/drawing/2016/5/11/chartex" xmlns:cx6="http://schemas.microsoft.com/office/drawing/2016/5/12/chartex" xmlns:cx7="http://schemas.microsoft.com/office/drawing/2016/5/13/chartex" xmlns:cx8="http://schemas.microsoft.com/office/drawing/2016/5/14/chartex" xmlns:mc="http://schemas.openxmlformats.org/markup-compatibility/2006" xmlns:aink="http://schemas.microsoft.com/office/drawing/2016/ink" xmlns:am3d="http://schemas.microsoft.com/office/drawing/2017/model3d" xmlns:o="urn:schemas-microsoft-com:office:office" xmlns:oel="http://schemas.microsoft.com/office/2019/extlst" xmlns:r="http://schemas.openxmlformats.org/officeDocument/2006/relationships" xmlns:m="http://schemas.openxmlformats.org/officeDocument/2006/math" xmlns:v="urn:schemas-microsoft-com:vml" xmlns:wp14="http://schemas.microsoft.com/office/word/2010/wordprocessingDrawing" xmlns:wp="http://schemas.openxmlformats.org/drawingml/2006/wordprocessingDrawing" xmlns:w10="urn:schemas-microsoft-com:office:word" xmlns:w="http://schemas.openxmlformats.org/wordprocessingml/2006/main" xmlns:w14="http://schemas.microsoft.com/office/word/2010/wordml" xmlns:w15="http://schemas.microsoft.com/office/word/2012/wordml" xmlns:w16cex="http://schemas.microsoft.com/office/word/2018/wordml/cex" xmlns:w16cid="http://schemas.microsoft.com/office/word/2016/wordml/cid" xmlns:w16="http://schemas.microsoft.com/office/word/2018/wordml" xmlns:w16du="http://schemas.microsoft.com/office/word/2023/wordml/word16du" xmlns:w16sdtdh="http://schemas.microsoft.com/office/word/2020/wordml/sdtdatahash" xmlns:w16sdtfl="http://schemas.microsoft.com/office/word/2024/wordml/sdtformatlock" xmlns:w16se="http://schemas.microsoft.com/office/word/2015/wordml/symex" xmlns:wpg="http://schemas.microsoft.com/office/word/2010/wordprocessingGroup" xmlns:wpi="http://schemas.microsoft.com/office/word/2010/wordprocessingInk" xmlns:wne="http://schemas.microsoft.com/office/word/2006/wordml" xmlns:wps="http://schemas.microsoft.com/office/word/2010/wordprocessingShape" mc:Ignorable="w14 w15 w16se w16cid w16 w16cex w16sdtdh w16sdtfl w16du wp14">
-  <w:p>
-    <w:pPr>
-      <w:pStyle w:val="Header"/>
-    </w:pPr>
-  </w:p>
-</w:hdr>
-</file>
-
 <file path=word/numbering.xml><?xml version="1.0" encoding="utf-8"?>
 <w:numbering xmlns:wpc="http://schemas.microsoft.com/office/word/2010/wordprocessingCanvas" xmlns:cx="http://schemas.microsoft.com/office/drawing/2014/chartex" xmlns:cx1="http://schemas.microsoft.com/office/drawing/2015/9/8/chartex" xmlns:cx2="http://schemas.microsoft.com/office/drawing/2015/10/21/chartex" xmlns:cx3="http://schemas.microsoft.com/office/drawing/2016/5/9/chartex" xmlns:cx4="http://schemas.microsoft.com/office/drawing/2016/5/10/chartex" xmlns:cx5="http://schemas.microsoft.com/office/drawing/2016/5/11/chartex" xmlns:cx6="http://schemas.microsoft.com/office/drawing/2016/5/12/chartex" xmlns:cx7="http://schemas.microsoft.com/office/drawing/2016/5/13/chartex" xmlns:cx8="http://schemas.microsoft.com/office/drawing/2016/5/14/chartex" xmlns:mc="http://schemas.openxmlformats.org/markup-compatibility/2006" xmlns:aink="http://schemas.microsoft.com/office/drawing/2016/ink" xmlns:am3d="http://schemas.microsoft.com/office/drawing/2017/model3d" xmlns:o="urn:schemas-microsoft-com:office:office" xmlns:oel="http://schemas.microsoft.com/office/2019/extlst" xmlns:r="http://schemas.openxmlformats.org/officeDocument/2006/relationships" xmlns:m="http://schemas.openxmlformats.org/officeDocument/2006/math" xmlns:v="urn:schemas-microsoft-com:vml" xmlns:wp14="http://schemas.microsoft.com/office/word/2010/wordprocessingDrawing" xmlns:wp="http://schemas.openxmlformats.org/drawingml/2006/wordprocessingDrawing" xmlns:w10="urn:schemas-microsoft-com:office:word" xmlns:w="http://schemas.openxmlformats.org/wordprocessingml/2006/main" xmlns:w14="http://schemas.microsoft.com/office/word/2010/wordml" xmlns:w15="http://schemas.microsoft.com/office/word/2012/wordml" xmlns:w16cex="http://schemas.microsoft.com/office/word/2018/wordml/cex" xmlns:w16cid="http://schemas.microsoft.com/office/word/2016/wordml/cid" xmlns:w16="http://schemas.microsoft.com/office/word/2018/wordml" xmlns:w16du="http://schemas.microsoft.com/office/word/2023/wordml/word16du" xmlns:w16sdtdh="http://schemas.microsoft.com/office/word/2020/wordml/sdtdatahash" xmlns:w16sdtfl="http://schemas.microsoft.com/office/word/2024/wordml/sdtformatlock" xmlns:w16se="http://schemas.microsoft.com/office/word/2015/wordml/symex" xmlns:wpg="http://schemas.microsoft.com/office/word/2010/wordprocessingGroup" xmlns:wpi="http://schemas.microsoft.com/office/word/2010/wordprocessingInk" xmlns:wne="http://schemas.microsoft.com/office/word/2006/wordml" xmlns:wps="http://schemas.microsoft.com/office/word/2010/wordprocessingShape" mc:Ignorable="w14 w15 w16se w16cid w16 w16cex w16sdtdh w16sdtfl w16du wp14">
   <w:abstractNum w:abstractNumId="0" w15:restartNumberingAfterBreak="0">
@@ -19121,7 +19132,7 @@
         <w:ind w:left="1180" w:hanging="360"/>
       </w:pPr>
     </w:lvl>
-    <w:lvl w:ilvl="1" w:tplc="04090019" w:tentative="1">
+    <w:lvl w:ilvl="1" w:tplc="04090019">
       <w:start w:val="1"/>
       <w:numFmt w:val="lowerLetter"/>
       <w:lvlText w:val="%2."/>
@@ -23945,6 +23956,31 @@
 </file>
 
 <file path=customXml/item1.xml><?xml version="1.0" encoding="utf-8"?>
+<p:properties xmlns:p="http://schemas.microsoft.com/office/2006/metadata/properties" xmlns:xsi="http://www.w3.org/2001/XMLSchema-instance" xmlns:pc="http://schemas.microsoft.com/office/infopath/2007/PartnerControls">
+  <documentManagement>
+    <_Flow_SignoffStatus xmlns="a0846abc-da76-433d-b89e-11ed84fbaeb3" xsi:nil="true"/>
+    <lcf76f155ced4ddcb4097134ff3c332f xmlns="a0846abc-da76-433d-b89e-11ed84fbaeb3">
+      <Terms xmlns="http://schemas.microsoft.com/office/infopath/2007/PartnerControls"/>
+    </lcf76f155ced4ddcb4097134ff3c332f>
+    <TaxCatchAll xmlns="4b0b2adc-e4a8-4832-bb38-e3a7e820179b" xsi:nil="true"/>
+  </documentManagement>
+</p:properties>
+</file>
+
+<file path=customXml/item2.xml><?xml version="1.0" encoding="utf-8"?>
+<b:Sources xmlns:b="http://schemas.openxmlformats.org/officeDocument/2006/bibliography" xmlns="http://schemas.openxmlformats.org/officeDocument/2006/bibliography" SelectedStyle="\APASixthEditionOfficeOnline.xsl" StyleName="APA" Version="6"/>
+</file>
+
+<file path=customXml/item3.xml><?xml version="1.0" encoding="utf-8"?>
+<?mso-contentType ?>
+<FormTemplates xmlns="http://schemas.microsoft.com/sharepoint/v3/contenttype/forms">
+  <Display>DocumentLibraryForm</Display>
+  <Edit>DocumentLibraryForm</Edit>
+  <New>DocumentLibraryForm</New>
+</FormTemplates>
+</file>
+
+<file path=customXml/item4.xml><?xml version="1.0" encoding="utf-8"?>
 <ct:contentTypeSchema xmlns:ct="http://schemas.microsoft.com/office/2006/metadata/contentType" xmlns:ma="http://schemas.microsoft.com/office/2006/metadata/properties/metaAttributes" ct:_="" ma:_="" ma:contentTypeName="Document" ma:contentTypeID="0x010100095F958C9057D64E8725F7631168A218" ma:contentTypeVersion="24" ma:contentTypeDescription="Create a new document." ma:contentTypeScope="" ma:versionID="0181d0ef269031616f304220f34fcec3">
   <xsd:schema xmlns:xsd="http://www.w3.org/2001/XMLSchema" xmlns:xs="http://www.w3.org/2001/XMLSchema" xmlns:p="http://schemas.microsoft.com/office/2006/metadata/properties" xmlns:ns2="a0846abc-da76-433d-b89e-11ed84fbaeb3" xmlns:ns3="4b0b2adc-e4a8-4832-bb38-e3a7e820179b" targetNamespace="http://schemas.microsoft.com/office/2006/metadata/properties" ma:root="true" ma:fieldsID="8fea1687251d818162f479617e9b8afa" ns2:_="" ns3:_="">
     <xsd:import namespace="a0846abc-da76-433d-b89e-11ed84fbaeb3"/>
@@ -24211,32 +24247,34 @@
 </ct:contentTypeSchema>
 </file>
 
-<file path=customXml/item2.xml><?xml version="1.0" encoding="utf-8"?>
-<?mso-contentType ?>
-<FormTemplates xmlns="http://schemas.microsoft.com/sharepoint/v3/contenttype/forms">
-  <Display>DocumentLibraryForm</Display>
-  <Edit>DocumentLibraryForm</Edit>
-  <New>DocumentLibraryForm</New>
-</FormTemplates>
+<file path=customXml/itemProps1.xml><?xml version="1.0" encoding="utf-8"?>
+<ds:datastoreItem xmlns:ds="http://schemas.openxmlformats.org/officeDocument/2006/customXml" ds:itemID="{06AF3FC3-CD02-49E6-93A5-73EE653BBDCC}">
+  <ds:schemaRefs>
+    <ds:schemaRef ds:uri="http://schemas.microsoft.com/office/2006/metadata/properties"/>
+    <ds:schemaRef ds:uri="http://schemas.microsoft.com/office/infopath/2007/PartnerControls"/>
+    <ds:schemaRef ds:uri="a0846abc-da76-433d-b89e-11ed84fbaeb3"/>
+    <ds:schemaRef ds:uri="4b0b2adc-e4a8-4832-bb38-e3a7e820179b"/>
+  </ds:schemaRefs>
+</ds:datastoreItem>
 </file>
 
-<file path=customXml/item3.xml><?xml version="1.0" encoding="utf-8"?>
-<b:Sources xmlns:b="http://schemas.openxmlformats.org/officeDocument/2006/bibliography" xmlns="http://schemas.openxmlformats.org/officeDocument/2006/bibliography" SelectedStyle="\APASixthEditionOfficeOnline.xsl" StyleName="APA" Version="6"/>
+<file path=customXml/itemProps2.xml><?xml version="1.0" encoding="utf-8"?>
+<ds:datastoreItem xmlns:ds="http://schemas.openxmlformats.org/officeDocument/2006/customXml" ds:itemID="{31A8F991-F2C3-4A98-93A0-9F15F02E83A7}">
+  <ds:schemaRefs>
+    <ds:schemaRef ds:uri="http://schemas.openxmlformats.org/officeDocument/2006/bibliography"/>
+  </ds:schemaRefs>
+</ds:datastoreItem>
 </file>
 
-<file path=customXml/item4.xml><?xml version="1.0" encoding="utf-8"?>
-<p:properties xmlns:p="http://schemas.microsoft.com/office/2006/metadata/properties" xmlns:xsi="http://www.w3.org/2001/XMLSchema-instance" xmlns:pc="http://schemas.microsoft.com/office/infopath/2007/PartnerControls">
-  <documentManagement>
-    <_Flow_SignoffStatus xmlns="a0846abc-da76-433d-b89e-11ed84fbaeb3" xsi:nil="true"/>
-    <lcf76f155ced4ddcb4097134ff3c332f xmlns="a0846abc-da76-433d-b89e-11ed84fbaeb3">
-      <Terms xmlns="http://schemas.microsoft.com/office/infopath/2007/PartnerControls"/>
-    </lcf76f155ced4ddcb4097134ff3c332f>
-    <TaxCatchAll xmlns="4b0b2adc-e4a8-4832-bb38-e3a7e820179b" xsi:nil="true"/>
-  </documentManagement>
-</p:properties>
+<file path=customXml/itemProps3.xml><?xml version="1.0" encoding="utf-8"?>
+<ds:datastoreItem xmlns:ds="http://schemas.openxmlformats.org/officeDocument/2006/customXml" ds:itemID="{B3B23335-743F-4ECA-B591-0D88F7E33FD2}">
+  <ds:schemaRefs>
+    <ds:schemaRef ds:uri="http://schemas.microsoft.com/sharepoint/v3/contenttype/forms"/>
+  </ds:schemaRefs>
+</ds:datastoreItem>
 </file>
 
-<file path=customXml/itemProps1.xml><?xml version="1.0" encoding="utf-8"?>
+<file path=customXml/itemProps4.xml><?xml version="1.0" encoding="utf-8"?>
 <ds:datastoreItem xmlns:ds="http://schemas.openxmlformats.org/officeDocument/2006/customXml" ds:itemID="{F20D8333-D2CC-42A6-B516-87CB1D2A20AC}">
   <ds:schemaRefs>
     <ds:schemaRef ds:uri="http://schemas.microsoft.com/office/2006/metadata/contentType"/>
@@ -24253,31 +24291,4 @@
     <ds:schemaRef ds:uri="http://schemas.microsoft.com/internal/obd"/>
   </ds:schemaRefs>
 </ds:datastoreItem>
-</file>
-
-<file path=customXml/itemProps2.xml><?xml version="1.0" encoding="utf-8"?>
-<ds:datastoreItem xmlns:ds="http://schemas.openxmlformats.org/officeDocument/2006/customXml" ds:itemID="{B3B23335-743F-4ECA-B591-0D88F7E33FD2}">
-  <ds:schemaRefs>
-    <ds:schemaRef ds:uri="http://schemas.microsoft.com/sharepoint/v3/contenttype/forms"/>
-  </ds:schemaRefs>
-</ds:datastoreItem>
-</file>
-
-<file path=customXml/itemProps3.xml><?xml version="1.0" encoding="utf-8"?>
-<ds:datastoreItem xmlns:ds="http://schemas.openxmlformats.org/officeDocument/2006/customXml" ds:itemID="{31A8F991-F2C3-4A98-93A0-9F15F02E83A7}">
-  <ds:schemaRefs>
-    <ds:schemaRef ds:uri="http://schemas.openxmlformats.org/officeDocument/2006/bibliography"/>
-  </ds:schemaRefs>
-</ds:datastoreItem>
-</file>
-
-<file path=customXml/itemProps4.xml><?xml version="1.0" encoding="utf-8"?>
-<ds:datastoreItem xmlns:ds="http://schemas.openxmlformats.org/officeDocument/2006/customXml" ds:itemID="{06AF3FC3-CD02-49E6-93A5-73EE653BBDCC}">
-  <ds:schemaRefs>
-    <ds:schemaRef ds:uri="http://schemas.microsoft.com/office/2006/metadata/properties"/>
-    <ds:schemaRef ds:uri="http://schemas.microsoft.com/office/infopath/2007/PartnerControls"/>
-    <ds:schemaRef ds:uri="a0846abc-da76-433d-b89e-11ed84fbaeb3"/>
-    <ds:schemaRef ds:uri="4b0b2adc-e4a8-4832-bb38-e3a7e820179b"/>
-  </ds:schemaRefs>
-</ds:datastoreItem>
 </file>
</xml_diff>

<commit_message>
feat: add guarantor NRIC merge tags to letter of offer
</commit_message>
<xml_diff>
--- a/apps/api/src/modules/applications/templates/arf-contract-facility-lo.docx
+++ b/apps/api/src/modules/applications/templates/arf-contract-facility-lo.docx
@@ -8608,7 +8608,15 @@
           <w:sz w:val="20"/>
           <w:szCs w:val="20"/>
         </w:rPr>
-        <w:t>NRIC :</w:t>
+        <w:t xml:space="preserve">NRIC : </w:t>
+      </w:r>
+      <w:r>
+        <w:rPr>
+          <w:sz w:val="20"/>
+          <w:szCs w:val="20"/>
+          <w:highlight w:val="yellow"/>
+        </w:rPr>
+        <w:t>{nric}</w:t>
       </w:r>
     </w:p>
     <w:p>
@@ -8941,46 +8949,6 @@
         </w:rPr>
         <w:t>{company_ssm}</w:t>
       </w:r>
-    </w:p>
-    <w:p>
-      <w:pPr>
-        <w:spacing w:line="360" w:lineRule="auto"/>
-        <w:jc w:val="both"/>
-        <w:rPr>
-          <w:sz w:val="20"/>
-          <w:szCs w:val="20"/>
-        </w:rPr>
-      </w:pPr>
-    </w:p>
-    <w:p>
-      <w:pPr>
-        <w:spacing w:line="360" w:lineRule="auto"/>
-        <w:jc w:val="both"/>
-        <w:rPr>
-          <w:sz w:val="20"/>
-          <w:szCs w:val="20"/>
-        </w:rPr>
-      </w:pPr>
-    </w:p>
-    <w:p>
-      <w:pPr>
-        <w:spacing w:line="360" w:lineRule="auto"/>
-        <w:jc w:val="both"/>
-        <w:rPr>
-          <w:sz w:val="20"/>
-          <w:szCs w:val="20"/>
-        </w:rPr>
-      </w:pPr>
-    </w:p>
-    <w:p>
-      <w:pPr>
-        <w:spacing w:line="360" w:lineRule="auto"/>
-        <w:jc w:val="both"/>
-        <w:rPr>
-          <w:sz w:val="20"/>
-          <w:szCs w:val="20"/>
-        </w:rPr>
-      </w:pPr>
     </w:p>
     <w:tbl>
       <w:tblPr>
@@ -8993,6 +8961,9 @@
         <w:gridCol w:w="4342"/>
       </w:tblGrid>
       <w:tr>
+        <w:trPr>
+          <w:cantSplit/>
+        </w:trPr>
         <w:tc>
           <w:tcPr>
             <w:tcW w:w="4675" w:type="dxa"/>
@@ -9047,23 +9018,7 @@
                 <w:sz w:val="20"/>
                 <w:szCs w:val="20"/>
               </w:rPr>
-              <w:t>{#signatory_</w:t>
-            </w:r>
-            <w:proofErr w:type="gramStart"/>
-            <w:r>
-              <w:rPr>
-                <w:sz w:val="20"/>
-                <w:szCs w:val="20"/>
-              </w:rPr>
-              <w:t>rows}_</w:t>
-            </w:r>
-            <w:proofErr w:type="gramEnd"/>
-            <w:r>
-              <w:rPr>
-                <w:sz w:val="20"/>
-                <w:szCs w:val="20"/>
-              </w:rPr>
-              <w:t>_____________________________</w:t>
+              <w:t>{#signatory_rows}______________________________</w:t>
             </w:r>
           </w:p>
           <w:p>
@@ -9098,7 +9053,15 @@
                 <w:sz w:val="20"/>
                 <w:szCs w:val="20"/>
               </w:rPr>
-              <w:t>NRIC :</w:t>
+              <w:t xml:space="preserve">NRIC : </w:t>
+            </w:r>
+            <w:r>
+              <w:rPr>
+                <w:sz w:val="20"/>
+                <w:szCs w:val="20"/>
+                <w:highlight w:val="yellow"/>
+              </w:rPr>
+              <w:t>{left_nric}</w:t>
             </w:r>
           </w:p>
           <w:p>
@@ -9173,23 +9136,7 @@
                 <w:sz w:val="20"/>
                 <w:szCs w:val="20"/>
               </w:rPr>
-              <w:t>{#show_</w:t>
-            </w:r>
-            <w:proofErr w:type="gramStart"/>
-            <w:r>
-              <w:rPr>
-                <w:sz w:val="20"/>
-                <w:szCs w:val="20"/>
-              </w:rPr>
-              <w:t>right}_</w:t>
-            </w:r>
-            <w:proofErr w:type="gramEnd"/>
-            <w:r>
-              <w:rPr>
-                <w:sz w:val="20"/>
-                <w:szCs w:val="20"/>
-              </w:rPr>
-              <w:t>_____________________________</w:t>
+              <w:t>{#show_right}______________________________</w:t>
             </w:r>
           </w:p>
           <w:p>
@@ -9224,7 +9171,15 @@
                 <w:sz w:val="20"/>
                 <w:szCs w:val="20"/>
               </w:rPr>
-              <w:t>NRIC :</w:t>
+              <w:t xml:space="preserve">NRIC : </w:t>
+            </w:r>
+            <w:r>
+              <w:rPr>
+                <w:sz w:val="20"/>
+                <w:szCs w:val="20"/>
+                <w:highlight w:val="yellow"/>
+              </w:rPr>
+              <w:t>{right_nric}</w:t>
             </w:r>
           </w:p>
           <w:p>

</xml_diff>